<commit_message>
Update ethics form 2022.796
</commit_message>
<xml_diff>
--- a/ethics/Lab-Online-Studies 2022_796/2022_HE000796 - PIS Paid (clean).docx
+++ b/ethics/Lab-Online-Studies 2022_796/2022_HE000796 - PIS Paid (clean).docx
@@ -1,6 +1,6 @@
 
 <file path=word/document.xml><?xml version="1.0" encoding="utf-8"?>
-<w:document xmlns:wpc="http://schemas.microsoft.com/office/word/2010/wordprocessingCanvas" xmlns:cx="http://schemas.microsoft.com/office/drawing/2014/chartex" xmlns:cx1="http://schemas.microsoft.com/office/drawing/2015/9/8/chartex" xmlns:cx2="http://schemas.microsoft.com/office/drawing/2015/10/21/chartex" xmlns:cx3="http://schemas.microsoft.com/office/drawing/2016/5/9/chartex" xmlns:cx4="http://schemas.microsoft.com/office/drawing/2016/5/10/chartex" xmlns:cx5="http://schemas.microsoft.com/office/drawing/2016/5/11/chartex" xmlns:cx6="http://schemas.microsoft.com/office/drawing/2016/5/12/chartex" xmlns:cx7="http://schemas.microsoft.com/office/drawing/2016/5/13/chartex" xmlns:cx8="http://schemas.microsoft.com/office/drawing/2016/5/14/chartex" xmlns:mc="http://schemas.openxmlformats.org/markup-compatibility/2006" xmlns:aink="http://schemas.microsoft.com/office/drawing/2016/ink" xmlns:am3d="http://schemas.microsoft.com/office/drawing/2017/model3d" xmlns:o="urn:schemas-microsoft-com:office:office" xmlns:oel="http://schemas.microsoft.com/office/2019/extlst" xmlns:r="http://schemas.openxmlformats.org/officeDocument/2006/relationships" xmlns:m="http://schemas.openxmlformats.org/officeDocument/2006/math" xmlns:v="urn:schemas-microsoft-com:vml" xmlns:wp14="http://schemas.microsoft.com/office/word/2010/wordprocessingDrawing" xmlns:wp="http://schemas.openxmlformats.org/drawingml/2006/wordprocessingDrawing" xmlns:w10="urn:schemas-microsoft-com:office:word" xmlns:w="http://schemas.openxmlformats.org/wordprocessingml/2006/main" xmlns:w14="http://schemas.microsoft.com/office/word/2010/wordml" xmlns:w15="http://schemas.microsoft.com/office/word/2012/wordml" xmlns:w16cex="http://schemas.microsoft.com/office/word/2018/wordml/cex" xmlns:w16cid="http://schemas.microsoft.com/office/word/2016/wordml/cid" xmlns:w16="http://schemas.microsoft.com/office/word/2018/wordml" xmlns:w16du="http://schemas.microsoft.com/office/word/2023/wordml/word16du" xmlns:w16sdtdh="http://schemas.microsoft.com/office/word/2020/wordml/sdtdatahash" xmlns:w16sdtfl="http://schemas.microsoft.com/office/word/2024/wordml/sdtformatlock" xmlns:w16se="http://schemas.microsoft.com/office/word/2015/wordml/symex" xmlns:wpg="http://schemas.microsoft.com/office/word/2010/wordprocessingGroup" xmlns:wpi="http://schemas.microsoft.com/office/word/2010/wordprocessingInk" xmlns:wne="http://schemas.microsoft.com/office/word/2006/wordml" xmlns:wps="http://schemas.microsoft.com/office/word/2010/wordprocessingShape" mc:Ignorable="w14 w15 w16se w16cid w16 w16cex w16sdtdh w16sdtfl w16du wp14">
+<w:document xmlns:wpc="http://schemas.microsoft.com/office/word/2010/wordprocessingCanvas" xmlns:cx="http://schemas.microsoft.com/office/drawing/2014/chartex" xmlns:cx1="http://schemas.microsoft.com/office/drawing/2015/9/8/chartex" xmlns:cx2="http://schemas.microsoft.com/office/drawing/2015/10/21/chartex" xmlns:cx3="http://schemas.microsoft.com/office/drawing/2016/5/9/chartex" xmlns:cx4="http://schemas.microsoft.com/office/drawing/2016/5/10/chartex" xmlns:cx5="http://schemas.microsoft.com/office/drawing/2016/5/11/chartex" xmlns:cx6="http://schemas.microsoft.com/office/drawing/2016/5/12/chartex" xmlns:cx7="http://schemas.microsoft.com/office/drawing/2016/5/13/chartex" xmlns:cx8="http://schemas.microsoft.com/office/drawing/2016/5/14/chartex" xmlns:mc="http://schemas.openxmlformats.org/markup-compatibility/2006" xmlns:m="http://schemas.openxmlformats.org/officeDocument/2006/math" xmlns:aink="http://schemas.microsoft.com/office/drawing/2016/ink" xmlns:am3d="http://schemas.microsoft.com/office/drawing/2017/model3d" xmlns:oel="http://schemas.microsoft.com/office/2019/extlst" xmlns:r="http://schemas.openxmlformats.org/officeDocument/2006/relationships" xmlns:wp14="http://schemas.microsoft.com/office/word/2010/wordprocessingDrawing" xmlns:wp="http://schemas.openxmlformats.org/drawingml/2006/wordprocessingDrawing" xmlns:wpg="http://schemas.microsoft.com/office/word/2010/wordprocessingGroup" xmlns:wpi="http://schemas.microsoft.com/office/word/2010/wordprocessingInk" xmlns:wps="http://schemas.microsoft.com/office/word/2010/wordprocessingShape" xmlns:o="urn:schemas-microsoft-com:office:office" xmlns:v="urn:schemas-microsoft-com:vml" xmlns:w10="urn:schemas-microsoft-com:office:word" xmlns:w="http://schemas.openxmlformats.org/wordprocessingml/2006/main" xmlns:w14="http://schemas.microsoft.com/office/word/2010/wordml" xmlns:w15="http://schemas.microsoft.com/office/word/2012/wordml" xmlns:w16cei="http://schemas.microsoft.com/office/word/2026/wordml/cei" xmlns:w16cex="http://schemas.microsoft.com/office/word/2018/wordml/cex" xmlns:w16cid="http://schemas.microsoft.com/office/word/2016/wordml/cid" xmlns:w16="http://schemas.microsoft.com/office/word/2018/wordml" xmlns:w16sdtdh="http://schemas.microsoft.com/office/word/2020/wordml/sdtdatahash" xmlns:w16sdtfl="http://schemas.microsoft.com/office/word/2024/wordml/sdtformatlock" xmlns:w16se="http://schemas.microsoft.com/office/word/2015/wordml/symex" xmlns:w16du="http://schemas.microsoft.com/office/word/2023/wordml/word16du" xmlns:wne="http://schemas.microsoft.com/office/word/2006/wordml" mc:Ignorable="w14 w15 w16se w16cid w16 w16cex w16sdtdh w16sdtfl w16du wp14">
   <w:body>
     <w:p>
       <w:pPr>
@@ -765,39 +765,7 @@
           <w:sz w:val="24"/>
           <w:szCs w:val="24"/>
         </w:rPr>
-        <w:t xml:space="preserve">Ms </w:t>
-      </w:r>
-      <w:r>
-        <w:rPr>
-          <w:color w:val="000000" w:themeColor="text1"/>
-          <w:sz w:val="24"/>
-          <w:szCs w:val="24"/>
-        </w:rPr>
-        <w:t>Cynthia Feng</w:t>
-      </w:r>
-      <w:r>
-        <w:rPr>
-          <w:color w:val="000000" w:themeColor="text1"/>
-          <w:sz w:val="24"/>
-          <w:szCs w:val="24"/>
-        </w:rPr>
-        <w:t xml:space="preserve">, PhD Student, School of Psychology, </w:t>
-      </w:r>
-      <w:r>
-        <w:rPr>
-          <w:color w:val="000000" w:themeColor="text1"/>
-          <w:sz w:val="24"/>
-          <w:szCs w:val="24"/>
-        </w:rPr>
-        <w:t>Un</w:t>
-      </w:r>
-      <w:r>
-        <w:rPr>
-          <w:color w:val="000000" w:themeColor="text1"/>
-          <w:sz w:val="24"/>
-          <w:szCs w:val="24"/>
-        </w:rPr>
-        <w:t>iversity of Sydney</w:t>
+        <w:t>Dr Dominic Tran, Research Fellow, School of Psychology, University of Sydney</w:t>
       </w:r>
     </w:p>
     <w:p>
@@ -827,23 +795,37 @@
         </w:rPr>
         <w:t xml:space="preserve">Ms </w:t>
       </w:r>
-      <w:proofErr w:type="spellStart"/>
       <w:r>
         <w:rPr>
           <w:color w:val="000000" w:themeColor="text1"/>
           <w:sz w:val="24"/>
           <w:szCs w:val="24"/>
         </w:rPr>
-        <w:t>Yueting</w:t>
-      </w:r>
-      <w:proofErr w:type="spellEnd"/>
+        <w:t>Cynthia Feng</w:t>
+      </w:r>
       <w:r>
         <w:rPr>
           <w:color w:val="000000" w:themeColor="text1"/>
           <w:sz w:val="24"/>
           <w:szCs w:val="24"/>
         </w:rPr>
-        <w:t xml:space="preserve"> Zhan, PhD Student, School of Psychology, University of Sydney</w:t>
+        <w:t xml:space="preserve">, PhD Student, School of Psychology, </w:t>
+      </w:r>
+      <w:r>
+        <w:rPr>
+          <w:color w:val="000000" w:themeColor="text1"/>
+          <w:sz w:val="24"/>
+          <w:szCs w:val="24"/>
+        </w:rPr>
+        <w:t>Un</w:t>
+      </w:r>
+      <w:r>
+        <w:rPr>
+          <w:color w:val="000000" w:themeColor="text1"/>
+          <w:sz w:val="24"/>
+          <w:szCs w:val="24"/>
+        </w:rPr>
+        <w:t>iversity of Sydney</w:t>
       </w:r>
     </w:p>
     <w:p>
@@ -867,11 +849,29 @@
       </w:pPr>
       <w:r>
         <w:rPr>
-          <w:rFonts w:cstheme="minorHAnsi"/>
-          <w:sz w:val="24"/>
-          <w:szCs w:val="28"/>
-        </w:rPr>
-        <w:t>Ms Mariya Bartosh, PhD Student, School of Psychology, University of Sydney</w:t>
+          <w:color w:val="000000" w:themeColor="text1"/>
+          <w:sz w:val="24"/>
+          <w:szCs w:val="24"/>
+        </w:rPr>
+        <w:t xml:space="preserve">Ms </w:t>
+      </w:r>
+      <w:proofErr w:type="spellStart"/>
+      <w:r>
+        <w:rPr>
+          <w:color w:val="000000" w:themeColor="text1"/>
+          <w:sz w:val="24"/>
+          <w:szCs w:val="24"/>
+        </w:rPr>
+        <w:t>Yueting</w:t>
+      </w:r>
+      <w:proofErr w:type="spellEnd"/>
+      <w:r>
+        <w:rPr>
+          <w:color w:val="000000" w:themeColor="text1"/>
+          <w:sz w:val="24"/>
+          <w:szCs w:val="24"/>
+        </w:rPr>
+        <w:t xml:space="preserve"> Zhan, PhD Student, School of Psychology, University of Sydney</w:t>
       </w:r>
     </w:p>
     <w:p>
@@ -899,39 +899,7 @@
           <w:sz w:val="24"/>
           <w:szCs w:val="28"/>
         </w:rPr>
-        <w:t xml:space="preserve">Ms </w:t>
-      </w:r>
-      <w:r>
-        <w:rPr>
-          <w:rFonts w:cstheme="minorHAnsi"/>
-          <w:sz w:val="24"/>
-          <w:szCs w:val="28"/>
-        </w:rPr>
-        <w:t>Natalie</w:t>
-      </w:r>
-      <w:r>
-        <w:rPr>
-          <w:rFonts w:cstheme="minorHAnsi"/>
-          <w:sz w:val="24"/>
-          <w:szCs w:val="28"/>
-        </w:rPr>
-        <w:t xml:space="preserve"> </w:t>
-      </w:r>
-      <w:r>
-        <w:rPr>
-          <w:rFonts w:cstheme="minorHAnsi"/>
-          <w:sz w:val="24"/>
-          <w:szCs w:val="28"/>
-        </w:rPr>
-        <w:t>Liu</w:t>
-      </w:r>
-      <w:r>
-        <w:rPr>
-          <w:rFonts w:cstheme="minorHAnsi"/>
-          <w:sz w:val="24"/>
-          <w:szCs w:val="28"/>
-        </w:rPr>
-        <w:t>, Honours Student, School of Psychology, University of Sydney</w:t>
+        <w:t>Ms Mariya Bartosh, PhD Student, School of Psychology, University of Sydney</w:t>
       </w:r>
     </w:p>
     <w:p>
@@ -959,39 +927,7 @@
           <w:sz w:val="24"/>
           <w:szCs w:val="28"/>
         </w:rPr>
-        <w:t xml:space="preserve">Ms </w:t>
-      </w:r>
-      <w:r>
-        <w:rPr>
-          <w:rFonts w:cstheme="minorHAnsi"/>
-          <w:sz w:val="24"/>
-          <w:szCs w:val="28"/>
-        </w:rPr>
-        <w:t>Michelle</w:t>
-      </w:r>
-      <w:r>
-        <w:rPr>
-          <w:rFonts w:cstheme="minorHAnsi"/>
-          <w:sz w:val="24"/>
-          <w:szCs w:val="28"/>
-        </w:rPr>
-        <w:t xml:space="preserve"> </w:t>
-      </w:r>
-      <w:r>
-        <w:rPr>
-          <w:rFonts w:cstheme="minorHAnsi"/>
-          <w:sz w:val="24"/>
-          <w:szCs w:val="28"/>
-        </w:rPr>
-        <w:t>Dao</w:t>
-      </w:r>
-      <w:r>
-        <w:rPr>
-          <w:rFonts w:cstheme="minorHAnsi"/>
-          <w:sz w:val="24"/>
-          <w:szCs w:val="28"/>
-        </w:rPr>
-        <w:t>, Honours Student, School of Psychology, University of Sydney</w:t>
+        <w:t>Ms Sheng-Ling Chang, PhD Student, School of Psychology, University of Sydney</w:t>
       </w:r>
     </w:p>
     <w:p>
@@ -1015,43 +951,27 @@
       </w:pPr>
       <w:r>
         <w:rPr>
-          <w:rFonts w:cstheme="minorHAnsi"/>
-          <w:sz w:val="24"/>
-          <w:szCs w:val="28"/>
-        </w:rPr>
-        <w:t xml:space="preserve">Ms </w:t>
-      </w:r>
-      <w:r>
-        <w:rPr>
-          <w:rFonts w:cstheme="minorHAnsi"/>
-          <w:sz w:val="24"/>
-          <w:szCs w:val="28"/>
-        </w:rPr>
-        <w:t>Isabella</w:t>
-      </w:r>
-      <w:r>
-        <w:rPr>
-          <w:rFonts w:cstheme="minorHAnsi"/>
-          <w:sz w:val="24"/>
-          <w:szCs w:val="28"/>
-        </w:rPr>
-        <w:t xml:space="preserve"> Evangelista, Honours Student, School of Psychology, University of Sydne</w:t>
-      </w:r>
-      <w:r>
-        <w:rPr>
-          <w:rFonts w:cstheme="minorHAnsi"/>
-          <w:sz w:val="24"/>
-          <w:szCs w:val="28"/>
-        </w:rPr>
-        <w:t>y</w:t>
-      </w:r>
-      <w:r>
-        <w:rPr>
-          <w:rFonts w:cstheme="minorHAnsi"/>
-          <w:sz w:val="24"/>
-          <w:szCs w:val="28"/>
-        </w:rPr>
-        <w:tab/>
+          <w:color w:val="000000" w:themeColor="text1"/>
+          <w:sz w:val="24"/>
+          <w:szCs w:val="24"/>
+        </w:rPr>
+        <w:t>Mr Liam Gialdi, MSc Student, Faculty of Medicine &amp; Health,</w:t>
+      </w:r>
+      <w:r>
+        <w:rPr>
+          <w:rFonts w:cstheme="minorHAnsi"/>
+          <w:sz w:val="24"/>
+          <w:szCs w:val="28"/>
+        </w:rPr>
+        <w:t xml:space="preserve"> </w:t>
+      </w:r>
+      <w:r>
+        <w:rPr>
+          <w:rFonts w:cstheme="minorHAnsi"/>
+          <w:sz w:val="24"/>
+          <w:szCs w:val="28"/>
+        </w:rPr>
+        <w:t>University of Sydney</w:t>
       </w:r>
     </w:p>
     <w:p>
@@ -1087,7 +1007,23 @@
           <w:sz w:val="24"/>
           <w:szCs w:val="28"/>
         </w:rPr>
-        <w:t>Ju Won Lee</w:t>
+        <w:t>Natalie</w:t>
+      </w:r>
+      <w:r>
+        <w:rPr>
+          <w:rFonts w:cstheme="minorHAnsi"/>
+          <w:sz w:val="24"/>
+          <w:szCs w:val="28"/>
+        </w:rPr>
+        <w:t xml:space="preserve"> </w:t>
+      </w:r>
+      <w:r>
+        <w:rPr>
+          <w:rFonts w:cstheme="minorHAnsi"/>
+          <w:sz w:val="24"/>
+          <w:szCs w:val="28"/>
+        </w:rPr>
+        <w:t>Liu</w:t>
       </w:r>
       <w:r>
         <w:rPr>
@@ -1123,7 +1059,15 @@
           <w:sz w:val="24"/>
           <w:szCs w:val="28"/>
         </w:rPr>
-        <w:t>Mr Riley Leckie, Research Assistant,</w:t>
+        <w:t xml:space="preserve">Ms </w:t>
+      </w:r>
+      <w:r>
+        <w:rPr>
+          <w:rFonts w:cstheme="minorHAnsi"/>
+          <w:sz w:val="24"/>
+          <w:szCs w:val="28"/>
+        </w:rPr>
+        <w:t>Michelle</w:t>
       </w:r>
       <w:r>
         <w:rPr>
@@ -1139,7 +1083,15 @@
           <w:sz w:val="24"/>
           <w:szCs w:val="28"/>
         </w:rPr>
-        <w:t>School of Psychology, University of Sydney</w:t>
+        <w:t>Dao</w:t>
+      </w:r>
+      <w:r>
+        <w:rPr>
+          <w:rFonts w:cstheme="minorHAnsi"/>
+          <w:sz w:val="24"/>
+          <w:szCs w:val="28"/>
+        </w:rPr>
+        <w:t>, Honours Student, School of Psychology, University of Sydney</w:t>
       </w:r>
     </w:p>
     <w:p>
@@ -1169,39 +1121,37 @@
         </w:rPr>
         <w:t xml:space="preserve">Ms </w:t>
       </w:r>
-      <w:proofErr w:type="spellStart"/>
-      <w:r>
-        <w:rPr>
-          <w:rFonts w:cstheme="minorHAnsi"/>
-          <w:sz w:val="24"/>
-          <w:szCs w:val="28"/>
-        </w:rPr>
-        <w:t>Imann</w:t>
-      </w:r>
-      <w:proofErr w:type="spellEnd"/>
-      <w:r>
-        <w:rPr>
-          <w:rFonts w:cstheme="minorHAnsi"/>
-          <w:sz w:val="24"/>
-          <w:szCs w:val="28"/>
-        </w:rPr>
-        <w:t xml:space="preserve"> Mian, Research Assistant,</w:t>
-      </w:r>
-      <w:r>
-        <w:rPr>
-          <w:rFonts w:cstheme="minorHAnsi"/>
-          <w:sz w:val="24"/>
-          <w:szCs w:val="28"/>
-        </w:rPr>
-        <w:t xml:space="preserve"> </w:t>
-      </w:r>
-      <w:r>
-        <w:rPr>
-          <w:rFonts w:cstheme="minorHAnsi"/>
-          <w:sz w:val="24"/>
-          <w:szCs w:val="28"/>
-        </w:rPr>
-        <w:t>School of Psychology, University of Sydney</w:t>
+      <w:r>
+        <w:rPr>
+          <w:rFonts w:cstheme="minorHAnsi"/>
+          <w:sz w:val="24"/>
+          <w:szCs w:val="28"/>
+        </w:rPr>
+        <w:t>Isabella</w:t>
+      </w:r>
+      <w:r>
+        <w:rPr>
+          <w:rFonts w:cstheme="minorHAnsi"/>
+          <w:sz w:val="24"/>
+          <w:szCs w:val="28"/>
+        </w:rPr>
+        <w:t xml:space="preserve"> Evangelista, Honours Student, School of Psychology, University of Sydne</w:t>
+      </w:r>
+      <w:r>
+        <w:rPr>
+          <w:rFonts w:cstheme="minorHAnsi"/>
+          <w:sz w:val="24"/>
+          <w:szCs w:val="28"/>
+        </w:rPr>
+        <w:t>y</w:t>
+      </w:r>
+      <w:r>
+        <w:rPr>
+          <w:rFonts w:cstheme="minorHAnsi"/>
+          <w:sz w:val="24"/>
+          <w:szCs w:val="28"/>
+        </w:rPr>
+        <w:tab/>
       </w:r>
     </w:p>
     <w:p>
@@ -1229,23 +1179,23 @@
           <w:sz w:val="24"/>
           <w:szCs w:val="28"/>
         </w:rPr>
-        <w:t>Mr Felix Pfeifer, Research Assistant,</w:t>
-      </w:r>
-      <w:r>
-        <w:rPr>
-          <w:rFonts w:cstheme="minorHAnsi"/>
-          <w:sz w:val="24"/>
-          <w:szCs w:val="28"/>
-        </w:rPr>
-        <w:t xml:space="preserve"> </w:t>
-      </w:r>
-      <w:r>
-        <w:rPr>
-          <w:rFonts w:cstheme="minorHAnsi"/>
-          <w:sz w:val="24"/>
-          <w:szCs w:val="28"/>
-        </w:rPr>
-        <w:t>School of Psychology, University of Sydney</w:t>
+        <w:t xml:space="preserve">Ms </w:t>
+      </w:r>
+      <w:r>
+        <w:rPr>
+          <w:rFonts w:cstheme="minorHAnsi"/>
+          <w:sz w:val="24"/>
+          <w:szCs w:val="28"/>
+        </w:rPr>
+        <w:t>Ju Won Lee</w:t>
+      </w:r>
+      <w:r>
+        <w:rPr>
+          <w:rFonts w:cstheme="minorHAnsi"/>
+          <w:sz w:val="24"/>
+          <w:szCs w:val="28"/>
+        </w:rPr>
+        <w:t>, Honours Student, School of Psychology, University of Sydney</w:t>
       </w:r>
     </w:p>
     <w:p>
@@ -1273,23 +1223,7 @@
           <w:sz w:val="24"/>
           <w:szCs w:val="28"/>
         </w:rPr>
-        <w:t xml:space="preserve">Mr </w:t>
-      </w:r>
-      <w:r>
-        <w:rPr>
-          <w:rFonts w:cstheme="minorHAnsi"/>
-          <w:sz w:val="24"/>
-          <w:szCs w:val="28"/>
-        </w:rPr>
-        <w:t>Aditya Sridhar</w:t>
-      </w:r>
-      <w:r>
-        <w:rPr>
-          <w:rFonts w:cstheme="minorHAnsi"/>
-          <w:sz w:val="24"/>
-          <w:szCs w:val="28"/>
-        </w:rPr>
-        <w:t>, Research Assistant,</w:t>
+        <w:t>Mr Riley Leckie, Research Assistant,</w:t>
       </w:r>
       <w:r>
         <w:rPr>
@@ -1320,39 +1254,38 @@
         <w:autoSpaceDN w:val="0"/>
         <w:adjustRightInd w:val="0"/>
         <w:spacing w:after="0" w:line="240" w:lineRule="auto"/>
-        <w:jc w:val="both"/>
         <w:textAlignment w:val="baseline"/>
         <w:rPr>
-          <w:rFonts w:cstheme="minorHAnsi"/>
-          <w:b/>
-          <w:bCs/>
-          <w:sz w:val="24"/>
-          <w:szCs w:val="28"/>
-        </w:rPr>
-      </w:pPr>
-      <w:r>
-        <w:rPr>
           <w:color w:val="000000" w:themeColor="text1"/>
           <w:sz w:val="24"/>
           <w:szCs w:val="24"/>
         </w:rPr>
-        <w:t>Mr Riley Landfear</w:t>
-      </w:r>
-      <w:r>
-        <w:rPr>
-          <w:color w:val="000000" w:themeColor="text1"/>
-          <w:sz w:val="24"/>
-          <w:szCs w:val="24"/>
-        </w:rPr>
-        <w:t xml:space="preserve">, </w:t>
-      </w:r>
-      <w:r>
-        <w:rPr>
-          <w:rFonts w:cstheme="minorHAnsi"/>
-          <w:sz w:val="24"/>
-          <w:szCs w:val="28"/>
-        </w:rPr>
-        <w:t>Research Assistant,</w:t>
+      </w:pPr>
+      <w:r>
+        <w:rPr>
+          <w:rFonts w:cstheme="minorHAnsi"/>
+          <w:sz w:val="24"/>
+          <w:szCs w:val="28"/>
+        </w:rPr>
+        <w:t xml:space="preserve">Ms </w:t>
+      </w:r>
+      <w:proofErr w:type="spellStart"/>
+      <w:r>
+        <w:rPr>
+          <w:rFonts w:cstheme="minorHAnsi"/>
+          <w:sz w:val="24"/>
+          <w:szCs w:val="28"/>
+        </w:rPr>
+        <w:t>Imann</w:t>
+      </w:r>
+      <w:proofErr w:type="spellEnd"/>
+      <w:r>
+        <w:rPr>
+          <w:rFonts w:cstheme="minorHAnsi"/>
+          <w:sz w:val="24"/>
+          <w:szCs w:val="28"/>
+        </w:rPr>
+        <w:t xml:space="preserve"> Mian, Research Assistant,</w:t>
       </w:r>
       <w:r>
         <w:rPr>
@@ -1383,31 +1316,20 @@
         <w:autoSpaceDN w:val="0"/>
         <w:adjustRightInd w:val="0"/>
         <w:spacing w:after="0" w:line="240" w:lineRule="auto"/>
-        <w:jc w:val="both"/>
         <w:textAlignment w:val="baseline"/>
         <w:rPr>
-          <w:rFonts w:cstheme="minorHAnsi"/>
-          <w:b/>
-          <w:bCs/>
-          <w:sz w:val="24"/>
-          <w:szCs w:val="28"/>
-        </w:rPr>
-      </w:pPr>
-      <w:r>
-        <w:rPr>
           <w:color w:val="000000" w:themeColor="text1"/>
           <w:sz w:val="24"/>
           <w:szCs w:val="24"/>
         </w:rPr>
-        <w:t>Mr Eoin Shepherd, Denison Student</w:t>
-      </w:r>
-      <w:r>
-        <w:rPr>
-          <w:rFonts w:cstheme="minorHAnsi"/>
-          <w:sz w:val="24"/>
-          <w:szCs w:val="28"/>
-        </w:rPr>
-        <w:t>,</w:t>
+      </w:pPr>
+      <w:r>
+        <w:rPr>
+          <w:rFonts w:cstheme="minorHAnsi"/>
+          <w:sz w:val="24"/>
+          <w:szCs w:val="28"/>
+        </w:rPr>
+        <w:t>Mr Felix Pfeifer, Research Assistant,</w:t>
       </w:r>
       <w:r>
         <w:rPr>
@@ -1438,7 +1360,6 @@
         <w:autoSpaceDN w:val="0"/>
         <w:adjustRightInd w:val="0"/>
         <w:spacing w:after="0" w:line="240" w:lineRule="auto"/>
-        <w:jc w:val="both"/>
         <w:textAlignment w:val="baseline"/>
         <w:rPr>
           <w:color w:val="000000" w:themeColor="text1"/>
@@ -1448,25 +1369,59 @@
       </w:pPr>
       <w:r>
         <w:rPr>
-          <w:color w:val="000000" w:themeColor="text1"/>
-          <w:sz w:val="24"/>
-          <w:szCs w:val="24"/>
-        </w:rPr>
-        <w:t>Ms Lina Kim, Denison Student</w:t>
-      </w:r>
-      <w:r>
-        <w:rPr>
-          <w:rFonts w:cstheme="minorHAnsi"/>
-          <w:sz w:val="24"/>
-          <w:szCs w:val="28"/>
-        </w:rPr>
-        <w:t>, School of Psychology, University of Sydney</w:t>
-      </w:r>
-    </w:p>
-    <w:p>
-      <w:pPr>
-        <w:spacing w:after="0"/>
-        <w:jc w:val="both"/>
+          <w:rFonts w:cstheme="minorHAnsi"/>
+          <w:sz w:val="24"/>
+          <w:szCs w:val="28"/>
+        </w:rPr>
+        <w:t xml:space="preserve">Mr </w:t>
+      </w:r>
+      <w:r>
+        <w:rPr>
+          <w:rFonts w:cstheme="minorHAnsi"/>
+          <w:sz w:val="24"/>
+          <w:szCs w:val="28"/>
+        </w:rPr>
+        <w:t>Aditya Sridhar</w:t>
+      </w:r>
+      <w:r>
+        <w:rPr>
+          <w:rFonts w:cstheme="minorHAnsi"/>
+          <w:sz w:val="24"/>
+          <w:szCs w:val="28"/>
+        </w:rPr>
+        <w:t>, Research Assistant,</w:t>
+      </w:r>
+      <w:r>
+        <w:rPr>
+          <w:rFonts w:cstheme="minorHAnsi"/>
+          <w:sz w:val="24"/>
+          <w:szCs w:val="28"/>
+        </w:rPr>
+        <w:t xml:space="preserve"> </w:t>
+      </w:r>
+      <w:r>
+        <w:rPr>
+          <w:rFonts w:cstheme="minorHAnsi"/>
+          <w:sz w:val="24"/>
+          <w:szCs w:val="28"/>
+        </w:rPr>
+        <w:t>School of Psychology, University of Sydney</w:t>
+      </w:r>
+    </w:p>
+    <w:p>
+      <w:pPr>
+        <w:pStyle w:val="ListParagraph"/>
+        <w:numPr>
+          <w:ilvl w:val="0"/>
+          <w:numId w:val="9"/>
+        </w:numPr>
+        <w:overflowPunct w:val="0"/>
+        <w:autoSpaceDE w:val="0"/>
+        <w:autoSpaceDN w:val="0"/>
+        <w:adjustRightInd w:val="0"/>
+        <w:spacing w:after="0" w:line="240" w:lineRule="auto"/>
+        <w:jc w:val="both"/>
+        <w:textAlignment w:val="baseline"/>
         <w:rPr>
           <w:rFonts w:cstheme="minorHAnsi"/>
           <w:b/>
@@ -1475,6 +1430,151 @@
           <w:szCs w:val="28"/>
         </w:rPr>
       </w:pPr>
+      <w:r>
+        <w:rPr>
+          <w:color w:val="000000" w:themeColor="text1"/>
+          <w:sz w:val="24"/>
+          <w:szCs w:val="24"/>
+        </w:rPr>
+        <w:t>Mr Riley Landfear</w:t>
+      </w:r>
+      <w:r>
+        <w:rPr>
+          <w:color w:val="000000" w:themeColor="text1"/>
+          <w:sz w:val="24"/>
+          <w:szCs w:val="24"/>
+        </w:rPr>
+        <w:t xml:space="preserve">, </w:t>
+      </w:r>
+      <w:r>
+        <w:rPr>
+          <w:rFonts w:cstheme="minorHAnsi"/>
+          <w:sz w:val="24"/>
+          <w:szCs w:val="28"/>
+        </w:rPr>
+        <w:t>Research Assistant,</w:t>
+      </w:r>
+      <w:r>
+        <w:rPr>
+          <w:rFonts w:cstheme="minorHAnsi"/>
+          <w:sz w:val="24"/>
+          <w:szCs w:val="28"/>
+        </w:rPr>
+        <w:t xml:space="preserve"> </w:t>
+      </w:r>
+      <w:r>
+        <w:rPr>
+          <w:rFonts w:cstheme="minorHAnsi"/>
+          <w:sz w:val="24"/>
+          <w:szCs w:val="28"/>
+        </w:rPr>
+        <w:t>School of Psychology, University of Sydney</w:t>
+      </w:r>
+    </w:p>
+    <w:p>
+      <w:pPr>
+        <w:pStyle w:val="ListParagraph"/>
+        <w:numPr>
+          <w:ilvl w:val="0"/>
+          <w:numId w:val="9"/>
+        </w:numPr>
+        <w:overflowPunct w:val="0"/>
+        <w:autoSpaceDE w:val="0"/>
+        <w:autoSpaceDN w:val="0"/>
+        <w:adjustRightInd w:val="0"/>
+        <w:spacing w:after="0" w:line="240" w:lineRule="auto"/>
+        <w:jc w:val="both"/>
+        <w:textAlignment w:val="baseline"/>
+        <w:rPr>
+          <w:rFonts w:cstheme="minorHAnsi"/>
+          <w:b/>
+          <w:bCs/>
+          <w:sz w:val="24"/>
+          <w:szCs w:val="28"/>
+        </w:rPr>
+      </w:pPr>
+      <w:r>
+        <w:rPr>
+          <w:color w:val="000000" w:themeColor="text1"/>
+          <w:sz w:val="24"/>
+          <w:szCs w:val="24"/>
+        </w:rPr>
+        <w:t>Mr Eoin Shepherd, Denison Student</w:t>
+      </w:r>
+      <w:r>
+        <w:rPr>
+          <w:rFonts w:cstheme="minorHAnsi"/>
+          <w:sz w:val="24"/>
+          <w:szCs w:val="28"/>
+        </w:rPr>
+        <w:t>,</w:t>
+      </w:r>
+      <w:r>
+        <w:rPr>
+          <w:rFonts w:cstheme="minorHAnsi"/>
+          <w:sz w:val="24"/>
+          <w:szCs w:val="28"/>
+        </w:rPr>
+        <w:t xml:space="preserve"> </w:t>
+      </w:r>
+      <w:r>
+        <w:rPr>
+          <w:rFonts w:cstheme="minorHAnsi"/>
+          <w:sz w:val="24"/>
+          <w:szCs w:val="28"/>
+        </w:rPr>
+        <w:t>School of Psychology, University of Sydney</w:t>
+      </w:r>
+    </w:p>
+    <w:p>
+      <w:pPr>
+        <w:pStyle w:val="ListParagraph"/>
+        <w:numPr>
+          <w:ilvl w:val="0"/>
+          <w:numId w:val="9"/>
+        </w:numPr>
+        <w:overflowPunct w:val="0"/>
+        <w:autoSpaceDE w:val="0"/>
+        <w:autoSpaceDN w:val="0"/>
+        <w:adjustRightInd w:val="0"/>
+        <w:spacing w:after="0" w:line="240" w:lineRule="auto"/>
+        <w:jc w:val="both"/>
+        <w:textAlignment w:val="baseline"/>
+        <w:rPr>
+          <w:color w:val="000000" w:themeColor="text1"/>
+          <w:sz w:val="24"/>
+          <w:szCs w:val="24"/>
+        </w:rPr>
+      </w:pPr>
+      <w:r>
+        <w:rPr>
+          <w:color w:val="000000" w:themeColor="text1"/>
+          <w:sz w:val="24"/>
+          <w:szCs w:val="24"/>
+        </w:rPr>
+        <w:t>Ms Lina Kim, Denison Student</w:t>
+      </w:r>
+      <w:r>
+        <w:rPr>
+          <w:rFonts w:cstheme="minorHAnsi"/>
+          <w:sz w:val="24"/>
+          <w:szCs w:val="28"/>
+        </w:rPr>
+        <w:t>, School of Psychology, University of Sydney</w:t>
+      </w:r>
+    </w:p>
+    <w:p>
+      <w:pPr>
+        <w:spacing w:after="0"/>
+        <w:jc w:val="both"/>
+        <w:rPr>
+          <w:rFonts w:cstheme="minorHAnsi"/>
+          <w:b/>
+          <w:bCs/>
+          <w:sz w:val="24"/>
+          <w:szCs w:val="28"/>
+        </w:rPr>
+      </w:pPr>
     </w:p>
     <w:p>
       <w:pPr>
@@ -1505,7 +1605,6 @@
           <w:sz w:val="24"/>
           <w:szCs w:val="28"/>
         </w:rPr>
-        <w:lastRenderedPageBreak/>
         <w:t xml:space="preserve">Data from this study may form the basis of the PhD theses of Mariya Bartosh, </w:t>
       </w:r>
       <w:proofErr w:type="spellStart"/>
@@ -1528,11 +1627,81 @@
       </w:r>
       <w:r>
         <w:rPr>
+          <w:color w:val="000000" w:themeColor="text1"/>
+          <w:sz w:val="24"/>
+          <w:szCs w:val="24"/>
+        </w:rPr>
+        <w:t>, Sheng-Ling Chang</w:t>
+      </w:r>
+      <w:r>
+        <w:rPr>
           <w:rFonts w:cstheme="minorHAnsi"/>
           <w:sz w:val="24"/>
           <w:szCs w:val="28"/>
         </w:rPr>
         <w:t xml:space="preserve"> and </w:t>
+      </w:r>
+      <w:r>
+        <w:rPr>
+          <w:color w:val="000000" w:themeColor="text1"/>
+          <w:sz w:val="24"/>
+          <w:szCs w:val="24"/>
+        </w:rPr>
+        <w:t xml:space="preserve">Cynthia Feng, the </w:t>
+      </w:r>
+      <w:proofErr w:type="spellStart"/>
+      <w:proofErr w:type="gramStart"/>
+      <w:r>
+        <w:rPr>
+          <w:color w:val="000000" w:themeColor="text1"/>
+          <w:sz w:val="24"/>
+          <w:szCs w:val="24"/>
+        </w:rPr>
+        <w:t>Masters</w:t>
+      </w:r>
+      <w:proofErr w:type="spellEnd"/>
+      <w:proofErr w:type="gramEnd"/>
+      <w:r>
+        <w:rPr>
+          <w:color w:val="000000" w:themeColor="text1"/>
+          <w:sz w:val="24"/>
+          <w:szCs w:val="24"/>
+        </w:rPr>
+        <w:t xml:space="preserve"> thesis of Liam </w:t>
+      </w:r>
+      <w:proofErr w:type="gramStart"/>
+      <w:r>
+        <w:rPr>
+          <w:color w:val="000000" w:themeColor="text1"/>
+          <w:sz w:val="24"/>
+          <w:szCs w:val="24"/>
+        </w:rPr>
+        <w:t>Gialdi,</w:t>
+      </w:r>
+      <w:r>
+        <w:rPr>
+          <w:rFonts w:cstheme="minorHAnsi"/>
+          <w:sz w:val="24"/>
+          <w:szCs w:val="28"/>
+        </w:rPr>
+        <w:t xml:space="preserve"> </w:t>
+      </w:r>
+      <w:r>
+        <w:rPr>
+          <w:rFonts w:cstheme="minorHAnsi"/>
+          <w:sz w:val="24"/>
+          <w:szCs w:val="28"/>
+        </w:rPr>
+        <w:t xml:space="preserve"> and</w:t>
+      </w:r>
+      <w:proofErr w:type="gramEnd"/>
+      <w:r>
+        <w:rPr>
+          <w:rFonts w:cstheme="minorHAnsi"/>
+          <w:sz w:val="24"/>
+          <w:szCs w:val="28"/>
+        </w:rPr>
+        <w:t xml:space="preserve"> </w:t>
       </w:r>
       <w:r>
         <w:rPr>
@@ -1837,6 +2006,265 @@
           <w:szCs w:val="24"/>
         </w:rPr>
         <w:t xml:space="preserve">*text included when relevant </w:t>
+      </w:r>
+    </w:p>
+    <w:p>
+      <w:pPr>
+        <w:spacing w:after="0" w:line="240" w:lineRule="auto"/>
+        <w:jc w:val="both"/>
+        <w:rPr>
+          <w:rFonts w:cstheme="minorHAnsi"/>
+          <w:sz w:val="24"/>
+          <w:szCs w:val="28"/>
+        </w:rPr>
+      </w:pPr>
+    </w:p>
+    <w:p>
+      <w:pPr>
+        <w:spacing w:after="0" w:line="240" w:lineRule="auto"/>
+        <w:jc w:val="both"/>
+        <w:rPr>
+          <w:rFonts w:cstheme="minorHAnsi"/>
+          <w:sz w:val="24"/>
+          <w:szCs w:val="28"/>
+          <w:lang w:val="en-GB"/>
+        </w:rPr>
+      </w:pPr>
+    </w:p>
+    <w:p>
+      <w:pPr>
+        <w:spacing w:after="0" w:line="240" w:lineRule="auto"/>
+        <w:ind w:left="360"/>
+        <w:jc w:val="both"/>
+        <w:rPr>
+          <w:rFonts w:cstheme="minorHAnsi"/>
+          <w:i/>
+          <w:iCs/>
+          <w:sz w:val="24"/>
+          <w:szCs w:val="28"/>
+          <w:lang w:val="en-GB"/>
+        </w:rPr>
+      </w:pPr>
+      <w:r>
+        <w:rPr>
+          <w:rFonts w:cstheme="minorHAnsi"/>
+          <w:i/>
+          <w:iCs/>
+          <w:sz w:val="24"/>
+          <w:szCs w:val="28"/>
+          <w:lang w:val="en-GB"/>
+        </w:rPr>
+        <w:t>*</w:t>
+      </w:r>
+      <w:r>
+        <w:rPr>
+          <w:rFonts w:cstheme="minorHAnsi"/>
+          <w:i/>
+          <w:iCs/>
+          <w:sz w:val="24"/>
+          <w:szCs w:val="28"/>
+          <w:lang w:val="en-GB"/>
+        </w:rPr>
+        <w:t xml:space="preserve">To better understand how specific aspects of cognition are regulated, we will measure ongoing activity in your brain. EEG (described in detail below) measures electrical fluctuations across the </w:t>
+      </w:r>
+      <w:proofErr w:type="gramStart"/>
+      <w:r>
+        <w:rPr>
+          <w:rFonts w:cstheme="minorHAnsi"/>
+          <w:i/>
+          <w:iCs/>
+          <w:sz w:val="24"/>
+          <w:szCs w:val="28"/>
+          <w:lang w:val="en-GB"/>
+        </w:rPr>
+        <w:t>scalp, and</w:t>
+      </w:r>
+      <w:proofErr w:type="gramEnd"/>
+      <w:r>
+        <w:rPr>
+          <w:rFonts w:cstheme="minorHAnsi"/>
+          <w:i/>
+          <w:iCs/>
+          <w:sz w:val="24"/>
+          <w:szCs w:val="28"/>
+          <w:lang w:val="en-GB"/>
+        </w:rPr>
+        <w:t xml:space="preserve"> involves the placement of a recording cap (like a swimming cap) on the head. This technique is used when very fine timing information is desired, </w:t>
+      </w:r>
+      <w:proofErr w:type="gramStart"/>
+      <w:r>
+        <w:rPr>
+          <w:rFonts w:cstheme="minorHAnsi"/>
+          <w:i/>
+          <w:iCs/>
+          <w:sz w:val="24"/>
+          <w:szCs w:val="28"/>
+          <w:lang w:val="en-GB"/>
+        </w:rPr>
+        <w:t>and also</w:t>
+      </w:r>
+      <w:proofErr w:type="gramEnd"/>
+      <w:r>
+        <w:rPr>
+          <w:rFonts w:cstheme="minorHAnsi"/>
+          <w:i/>
+          <w:iCs/>
+          <w:sz w:val="24"/>
+          <w:szCs w:val="28"/>
+          <w:lang w:val="en-GB"/>
+        </w:rPr>
+        <w:t xml:space="preserve"> when the localisation of neural activity is not of particular interest.</w:t>
+      </w:r>
+    </w:p>
+    <w:p>
+      <w:pPr>
+        <w:spacing w:after="0" w:line="240" w:lineRule="auto"/>
+        <w:ind w:left="360"/>
+        <w:jc w:val="both"/>
+        <w:rPr>
+          <w:rFonts w:cstheme="minorHAnsi"/>
+          <w:i/>
+          <w:iCs/>
+          <w:sz w:val="24"/>
+          <w:szCs w:val="28"/>
+          <w:lang w:val="en-GB"/>
+        </w:rPr>
+      </w:pPr>
+    </w:p>
+    <w:p>
+      <w:pPr>
+        <w:spacing w:after="0" w:line="240" w:lineRule="auto"/>
+        <w:ind w:left="360"/>
+        <w:jc w:val="both"/>
+        <w:rPr>
+          <w:rFonts w:cstheme="minorHAnsi"/>
+          <w:i/>
+          <w:iCs/>
+          <w:sz w:val="24"/>
+          <w:szCs w:val="28"/>
+          <w:lang w:val="en-GB"/>
+        </w:rPr>
+      </w:pPr>
+    </w:p>
+    <w:p>
+      <w:pPr>
+        <w:spacing w:after="0" w:line="240" w:lineRule="auto"/>
+        <w:ind w:left="360"/>
+        <w:jc w:val="both"/>
+        <w:rPr>
+          <w:rFonts w:cstheme="minorHAnsi"/>
+          <w:i/>
+          <w:iCs/>
+          <w:sz w:val="24"/>
+          <w:szCs w:val="28"/>
+          <w:lang w:val="en-GB"/>
+        </w:rPr>
+      </w:pPr>
+      <w:r>
+        <w:rPr>
+          <w:rFonts w:cstheme="minorHAnsi"/>
+          <w:i/>
+          <w:iCs/>
+          <w:sz w:val="24"/>
+          <w:szCs w:val="28"/>
+          <w:lang w:val="en-GB"/>
+        </w:rPr>
+        <w:t>EEG is used to measure the electrical activity of cells within your brain. The activity of underlying cells is recorded by sensors placed across your scalp. Recordings will be made using reusable electrodes contained within a custom-made cap that will be fitted to your head (much like wearing a swimming cap). To ensure good contact between the electrodes and your skin, the skin around all electrode sites will be sterilised and cleaned with alcohol, and conductive gel will be placed under each electrode.</w:t>
+      </w:r>
+    </w:p>
+    <w:p>
+      <w:pPr>
+        <w:spacing w:after="0" w:line="240" w:lineRule="auto"/>
+        <w:ind w:left="360"/>
+        <w:jc w:val="both"/>
+        <w:rPr>
+          <w:rFonts w:cstheme="minorHAnsi"/>
+          <w:i/>
+          <w:iCs/>
+          <w:sz w:val="24"/>
+          <w:szCs w:val="28"/>
+          <w:lang w:val="en-GB"/>
+        </w:rPr>
+      </w:pPr>
+      <w:r>
+        <w:rPr>
+          <w:rFonts w:cstheme="minorHAnsi"/>
+          <w:i/>
+          <w:iCs/>
+          <w:sz w:val="24"/>
+          <w:szCs w:val="28"/>
+          <w:lang w:val="en-GB"/>
+        </w:rPr>
+        <w:t xml:space="preserve">                                                                                                                    </w:t>
+      </w:r>
+    </w:p>
+    <w:p>
+      <w:pPr>
+        <w:spacing w:after="0" w:line="240" w:lineRule="auto"/>
+        <w:ind w:left="360"/>
+        <w:jc w:val="both"/>
+        <w:rPr>
+          <w:rFonts w:cstheme="minorHAnsi"/>
+          <w:sz w:val="24"/>
+          <w:szCs w:val="28"/>
+          <w:lang w:val="en-GB"/>
+        </w:rPr>
+      </w:pPr>
+      <w:r>
+        <w:rPr>
+          <w:rFonts w:cstheme="minorHAnsi"/>
+          <w:i/>
+          <w:iCs/>
+          <w:sz w:val="24"/>
+          <w:szCs w:val="28"/>
+          <w:lang w:val="en-GB"/>
+        </w:rPr>
+        <w:t xml:space="preserve">There are no known risks associated with EEG, though some redness or irritation can occur under the electrodes. This reaction can be due to either the alcohol/gel applied or the abrasive nature of its application (i.e., parting the hair and rubbing the gel into the scalp with a cotton tipped wooden stick). Note that the gel is applied to the surface of the scalp using a blunt syringe. Please advise the experimenter if you are not comfortable with the administration of the gel, e.g., phobia of needles. At the end of the recording session, conductive gel will remain in your hair, but this washes out easily with water. An opportunity to use our hair-washing sink is provided to you, and shampoo, conditioner, and a </w:t>
+      </w:r>
+      <w:proofErr w:type="gramStart"/>
+      <w:r>
+        <w:rPr>
+          <w:rFonts w:cstheme="minorHAnsi"/>
+          <w:i/>
+          <w:iCs/>
+          <w:sz w:val="24"/>
+          <w:szCs w:val="28"/>
+          <w:lang w:val="en-GB"/>
+        </w:rPr>
+        <w:t>hair-dryer</w:t>
+      </w:r>
+      <w:proofErr w:type="gramEnd"/>
+      <w:r>
+        <w:rPr>
+          <w:rFonts w:cstheme="minorHAnsi"/>
+          <w:i/>
+          <w:iCs/>
+          <w:sz w:val="24"/>
+          <w:szCs w:val="28"/>
+          <w:lang w:val="en-GB"/>
+        </w:rPr>
+        <w:t xml:space="preserve"> are also available. We kindly request that you avoid the use of hair products, such as gel, wax, or mousse on the day of the EEG experiment.</w:t>
+      </w:r>
+    </w:p>
+    <w:p>
+      <w:pPr>
+        <w:spacing w:after="0" w:line="240" w:lineRule="auto"/>
+        <w:ind w:firstLine="360"/>
+        <w:jc w:val="both"/>
+        <w:rPr>
+          <w:rFonts w:cstheme="minorHAnsi"/>
+          <w:sz w:val="24"/>
+          <w:szCs w:val="28"/>
+        </w:rPr>
+      </w:pPr>
+      <w:r>
+        <w:rPr>
+          <w:rFonts w:cstheme="minorHAnsi"/>
+          <w:sz w:val="24"/>
+          <w:szCs w:val="28"/>
+        </w:rPr>
+        <w:lastRenderedPageBreak/>
+        <w:t>[*Included only when EEG data is collected]</w:t>
       </w:r>
     </w:p>
     <w:p>
@@ -2808,7 +3236,16 @@
           <w:sz w:val="24"/>
           <w:szCs w:val="24"/>
         </w:rPr>
-        <w:t xml:space="preserve">By providing your consent you are allowing us to use your information in future projects. </w:t>
+        <w:t xml:space="preserve">By providing your consent you are allowing us to use your information in future </w:t>
+      </w:r>
+      <w:r>
+        <w:rPr>
+          <w:rFonts w:ascii="Calibri" w:hAnsi="Calibri"/>
+          <w:sz w:val="24"/>
+          <w:szCs w:val="24"/>
+        </w:rPr>
+        <w:lastRenderedPageBreak/>
+        <w:t xml:space="preserve">projects. </w:t>
       </w:r>
       <w:r>
         <w:rPr>
@@ -3340,7 +3777,6 @@
           <w:sz w:val="24"/>
           <w:szCs w:val="28"/>
         </w:rPr>
-        <w:lastRenderedPageBreak/>
         <w:t xml:space="preserve">If you are concerned about the way this study is being conducted or </w:t>
       </w:r>
       <w:proofErr w:type="gramStart"/>
@@ -3520,8 +3956,6 @@
       <w:headerReference w:type="default" r:id="rId18"/>
       <w:footerReference w:type="even" r:id="rId19"/>
       <w:footerReference w:type="default" r:id="rId20"/>
-      <w:headerReference w:type="first" r:id="rId21"/>
-      <w:footerReference w:type="first" r:id="rId22"/>
       <w:pgSz w:w="11906" w:h="16838"/>
       <w:pgMar w:top="1440" w:right="1440" w:bottom="1440" w:left="1440" w:header="708" w:footer="708" w:gutter="0"/>
       <w:cols w:space="708"/>
@@ -3532,7 +3966,7 @@
 </file>
 
 <file path=word/endnotes.xml><?xml version="1.0" encoding="utf-8"?>
-<w:endnotes xmlns:wpc="http://schemas.microsoft.com/office/word/2010/wordprocessingCanvas" xmlns:cx="http://schemas.microsoft.com/office/drawing/2014/chartex" xmlns:cx1="http://schemas.microsoft.com/office/drawing/2015/9/8/chartex" xmlns:cx2="http://schemas.microsoft.com/office/drawing/2015/10/21/chartex" xmlns:cx3="http://schemas.microsoft.com/office/drawing/2016/5/9/chartex" xmlns:cx4="http://schemas.microsoft.com/office/drawing/2016/5/10/chartex" xmlns:cx5="http://schemas.microsoft.com/office/drawing/2016/5/11/chartex" xmlns:cx6="http://schemas.microsoft.com/office/drawing/2016/5/12/chartex" xmlns:cx7="http://schemas.microsoft.com/office/drawing/2016/5/13/chartex" xmlns:cx8="http://schemas.microsoft.com/office/drawing/2016/5/14/chartex" xmlns:mc="http://schemas.openxmlformats.org/markup-compatibility/2006" xmlns:aink="http://schemas.microsoft.com/office/drawing/2016/ink" xmlns:am3d="http://schemas.microsoft.com/office/drawing/2017/model3d" xmlns:o="urn:schemas-microsoft-com:office:office" xmlns:oel="http://schemas.microsoft.com/office/2019/extlst" xmlns:r="http://schemas.openxmlformats.org/officeDocument/2006/relationships" xmlns:m="http://schemas.openxmlformats.org/officeDocument/2006/math" xmlns:v="urn:schemas-microsoft-com:vml" xmlns:wp14="http://schemas.microsoft.com/office/word/2010/wordprocessingDrawing" xmlns:wp="http://schemas.openxmlformats.org/drawingml/2006/wordprocessingDrawing" xmlns:w10="urn:schemas-microsoft-com:office:word" xmlns:w="http://schemas.openxmlformats.org/wordprocessingml/2006/main" xmlns:w14="http://schemas.microsoft.com/office/word/2010/wordml" xmlns:w15="http://schemas.microsoft.com/office/word/2012/wordml" xmlns:w16cex="http://schemas.microsoft.com/office/word/2018/wordml/cex" xmlns:w16cid="http://schemas.microsoft.com/office/word/2016/wordml/cid" xmlns:w16="http://schemas.microsoft.com/office/word/2018/wordml" xmlns:w16du="http://schemas.microsoft.com/office/word/2023/wordml/word16du" xmlns:w16sdtdh="http://schemas.microsoft.com/office/word/2020/wordml/sdtdatahash" xmlns:w16sdtfl="http://schemas.microsoft.com/office/word/2024/wordml/sdtformatlock" xmlns:w16se="http://schemas.microsoft.com/office/word/2015/wordml/symex" xmlns:wpg="http://schemas.microsoft.com/office/word/2010/wordprocessingGroup" xmlns:wpi="http://schemas.microsoft.com/office/word/2010/wordprocessingInk" xmlns:wne="http://schemas.microsoft.com/office/word/2006/wordml" xmlns:wps="http://schemas.microsoft.com/office/word/2010/wordprocessingShape" mc:Ignorable="w14 w15 w16se w16cid w16 w16cex w16sdtdh w16sdtfl w16du wp14">
+<w:endnotes xmlns:wpc="http://schemas.microsoft.com/office/word/2010/wordprocessingCanvas" xmlns:cx="http://schemas.microsoft.com/office/drawing/2014/chartex" xmlns:cx1="http://schemas.microsoft.com/office/drawing/2015/9/8/chartex" xmlns:cx2="http://schemas.microsoft.com/office/drawing/2015/10/21/chartex" xmlns:cx3="http://schemas.microsoft.com/office/drawing/2016/5/9/chartex" xmlns:cx4="http://schemas.microsoft.com/office/drawing/2016/5/10/chartex" xmlns:cx5="http://schemas.microsoft.com/office/drawing/2016/5/11/chartex" xmlns:cx6="http://schemas.microsoft.com/office/drawing/2016/5/12/chartex" xmlns:cx7="http://schemas.microsoft.com/office/drawing/2016/5/13/chartex" xmlns:cx8="http://schemas.microsoft.com/office/drawing/2016/5/14/chartex" xmlns:mc="http://schemas.openxmlformats.org/markup-compatibility/2006" xmlns:m="http://schemas.openxmlformats.org/officeDocument/2006/math" xmlns:aink="http://schemas.microsoft.com/office/drawing/2016/ink" xmlns:am3d="http://schemas.microsoft.com/office/drawing/2017/model3d" xmlns:oel="http://schemas.microsoft.com/office/2019/extlst" xmlns:r="http://schemas.openxmlformats.org/officeDocument/2006/relationships" xmlns:wp14="http://schemas.microsoft.com/office/word/2010/wordprocessingDrawing" xmlns:wp="http://schemas.openxmlformats.org/drawingml/2006/wordprocessingDrawing" xmlns:wpg="http://schemas.microsoft.com/office/word/2010/wordprocessingGroup" xmlns:wpi="http://schemas.microsoft.com/office/word/2010/wordprocessingInk" xmlns:wps="http://schemas.microsoft.com/office/word/2010/wordprocessingShape" xmlns:o="urn:schemas-microsoft-com:office:office" xmlns:v="urn:schemas-microsoft-com:vml" xmlns:w10="urn:schemas-microsoft-com:office:word" xmlns:w="http://schemas.openxmlformats.org/wordprocessingml/2006/main" xmlns:w14="http://schemas.microsoft.com/office/word/2010/wordml" xmlns:w15="http://schemas.microsoft.com/office/word/2012/wordml" xmlns:w16cei="http://schemas.microsoft.com/office/word/2026/wordml/cei" xmlns:w16cex="http://schemas.microsoft.com/office/word/2018/wordml/cex" xmlns:w16cid="http://schemas.microsoft.com/office/word/2016/wordml/cid" xmlns:w16="http://schemas.microsoft.com/office/word/2018/wordml" xmlns:w16sdtdh="http://schemas.microsoft.com/office/word/2020/wordml/sdtdatahash" xmlns:w16sdtfl="http://schemas.microsoft.com/office/word/2024/wordml/sdtformatlock" xmlns:w16se="http://schemas.microsoft.com/office/word/2015/wordml/symex" xmlns:w16du="http://schemas.microsoft.com/office/word/2023/wordml/word16du" xmlns:wne="http://schemas.microsoft.com/office/word/2006/wordml" mc:Ignorable="w14 w15 w16se w16cid w16 w16cex w16sdtdh w16sdtfl w16du wp14">
   <w:endnote w:type="separator" w:id="-1">
     <w:p>
       <w:pPr>
@@ -3559,7 +3993,7 @@
 </file>
 
 <file path=word/footer1.xml><?xml version="1.0" encoding="utf-8"?>
-<w:ftr xmlns:wpc="http://schemas.microsoft.com/office/word/2010/wordprocessingCanvas" xmlns:cx="http://schemas.microsoft.com/office/drawing/2014/chartex" xmlns:cx1="http://schemas.microsoft.com/office/drawing/2015/9/8/chartex" xmlns:cx2="http://schemas.microsoft.com/office/drawing/2015/10/21/chartex" xmlns:cx3="http://schemas.microsoft.com/office/drawing/2016/5/9/chartex" xmlns:cx4="http://schemas.microsoft.com/office/drawing/2016/5/10/chartex" xmlns:cx5="http://schemas.microsoft.com/office/drawing/2016/5/11/chartex" xmlns:cx6="http://schemas.microsoft.com/office/drawing/2016/5/12/chartex" xmlns:cx7="http://schemas.microsoft.com/office/drawing/2016/5/13/chartex" xmlns:cx8="http://schemas.microsoft.com/office/drawing/2016/5/14/chartex" xmlns:mc="http://schemas.openxmlformats.org/markup-compatibility/2006" xmlns:aink="http://schemas.microsoft.com/office/drawing/2016/ink" xmlns:am3d="http://schemas.microsoft.com/office/drawing/2017/model3d" xmlns:o="urn:schemas-microsoft-com:office:office" xmlns:oel="http://schemas.microsoft.com/office/2019/extlst" xmlns:r="http://schemas.openxmlformats.org/officeDocument/2006/relationships" xmlns:m="http://schemas.openxmlformats.org/officeDocument/2006/math" xmlns:v="urn:schemas-microsoft-com:vml" xmlns:wp14="http://schemas.microsoft.com/office/word/2010/wordprocessingDrawing" xmlns:wp="http://schemas.openxmlformats.org/drawingml/2006/wordprocessingDrawing" xmlns:w10="urn:schemas-microsoft-com:office:word" xmlns:w="http://schemas.openxmlformats.org/wordprocessingml/2006/main" xmlns:w14="http://schemas.microsoft.com/office/word/2010/wordml" xmlns:w15="http://schemas.microsoft.com/office/word/2012/wordml" xmlns:w16cex="http://schemas.microsoft.com/office/word/2018/wordml/cex" xmlns:w16cid="http://schemas.microsoft.com/office/word/2016/wordml/cid" xmlns:w16="http://schemas.microsoft.com/office/word/2018/wordml" xmlns:w16du="http://schemas.microsoft.com/office/word/2023/wordml/word16du" xmlns:w16sdtdh="http://schemas.microsoft.com/office/word/2020/wordml/sdtdatahash" xmlns:w16sdtfl="http://schemas.microsoft.com/office/word/2024/wordml/sdtformatlock" xmlns:w16se="http://schemas.microsoft.com/office/word/2015/wordml/symex" xmlns:wpg="http://schemas.microsoft.com/office/word/2010/wordprocessingGroup" xmlns:wpi="http://schemas.microsoft.com/office/word/2010/wordprocessingInk" xmlns:wne="http://schemas.microsoft.com/office/word/2006/wordml" xmlns:wps="http://schemas.microsoft.com/office/word/2010/wordprocessingShape" mc:Ignorable="w14 w15 w16se w16cid w16 w16cex w16sdtdh w16sdtfl w16du wp14">
+<w:ftr xmlns:wpc="http://schemas.microsoft.com/office/word/2010/wordprocessingCanvas" xmlns:cx="http://schemas.microsoft.com/office/drawing/2014/chartex" xmlns:cx1="http://schemas.microsoft.com/office/drawing/2015/9/8/chartex" xmlns:cx2="http://schemas.microsoft.com/office/drawing/2015/10/21/chartex" xmlns:cx3="http://schemas.microsoft.com/office/drawing/2016/5/9/chartex" xmlns:cx4="http://schemas.microsoft.com/office/drawing/2016/5/10/chartex" xmlns:cx5="http://schemas.microsoft.com/office/drawing/2016/5/11/chartex" xmlns:cx6="http://schemas.microsoft.com/office/drawing/2016/5/12/chartex" xmlns:cx7="http://schemas.microsoft.com/office/drawing/2016/5/13/chartex" xmlns:cx8="http://schemas.microsoft.com/office/drawing/2016/5/14/chartex" xmlns:mc="http://schemas.openxmlformats.org/markup-compatibility/2006" xmlns:m="http://schemas.openxmlformats.org/officeDocument/2006/math" xmlns:aink="http://schemas.microsoft.com/office/drawing/2016/ink" xmlns:am3d="http://schemas.microsoft.com/office/drawing/2017/model3d" xmlns:oel="http://schemas.microsoft.com/office/2019/extlst" xmlns:r="http://schemas.openxmlformats.org/officeDocument/2006/relationships" xmlns:wp14="http://schemas.microsoft.com/office/word/2010/wordprocessingDrawing" xmlns:wp="http://schemas.openxmlformats.org/drawingml/2006/wordprocessingDrawing" xmlns:wpg="http://schemas.microsoft.com/office/word/2010/wordprocessingGroup" xmlns:wpi="http://schemas.microsoft.com/office/word/2010/wordprocessingInk" xmlns:wps="http://schemas.microsoft.com/office/word/2010/wordprocessingShape" xmlns:o="urn:schemas-microsoft-com:office:office" xmlns:v="urn:schemas-microsoft-com:vml" xmlns:w10="urn:schemas-microsoft-com:office:word" xmlns:w="http://schemas.openxmlformats.org/wordprocessingml/2006/main" xmlns:w14="http://schemas.microsoft.com/office/word/2010/wordml" xmlns:w15="http://schemas.microsoft.com/office/word/2012/wordml" xmlns:w16cei="http://schemas.microsoft.com/office/word/2026/wordml/cei" xmlns:w16cex="http://schemas.microsoft.com/office/word/2018/wordml/cex" xmlns:w16cid="http://schemas.microsoft.com/office/word/2016/wordml/cid" xmlns:w16="http://schemas.microsoft.com/office/word/2018/wordml" xmlns:w16sdtdh="http://schemas.microsoft.com/office/word/2020/wordml/sdtdatahash" xmlns:w16sdtfl="http://schemas.microsoft.com/office/word/2024/wordml/sdtformatlock" xmlns:w16se="http://schemas.microsoft.com/office/word/2015/wordml/symex" xmlns:w16du="http://schemas.microsoft.com/office/word/2023/wordml/word16du" xmlns:wne="http://schemas.microsoft.com/office/word/2006/wordml" mc:Ignorable="w14 w15 w16se w16cid w16 w16cex w16sdtdh w16sdtfl w16du wp14">
   <w:p>
     <w:pPr>
       <w:pStyle w:val="Footer"/>
@@ -3570,7 +4004,7 @@
 </file>
 
 <file path=word/footer2.xml><?xml version="1.0" encoding="utf-8"?>
-<w:ftr xmlns:wpc="http://schemas.microsoft.com/office/word/2010/wordprocessingCanvas" xmlns:cx="http://schemas.microsoft.com/office/drawing/2014/chartex" xmlns:cx1="http://schemas.microsoft.com/office/drawing/2015/9/8/chartex" xmlns:cx2="http://schemas.microsoft.com/office/drawing/2015/10/21/chartex" xmlns:cx3="http://schemas.microsoft.com/office/drawing/2016/5/9/chartex" xmlns:cx4="http://schemas.microsoft.com/office/drawing/2016/5/10/chartex" xmlns:cx5="http://schemas.microsoft.com/office/drawing/2016/5/11/chartex" xmlns:cx6="http://schemas.microsoft.com/office/drawing/2016/5/12/chartex" xmlns:cx7="http://schemas.microsoft.com/office/drawing/2016/5/13/chartex" xmlns:cx8="http://schemas.microsoft.com/office/drawing/2016/5/14/chartex" xmlns:mc="http://schemas.openxmlformats.org/markup-compatibility/2006" xmlns:aink="http://schemas.microsoft.com/office/drawing/2016/ink" xmlns:am3d="http://schemas.microsoft.com/office/drawing/2017/model3d" xmlns:o="urn:schemas-microsoft-com:office:office" xmlns:oel="http://schemas.microsoft.com/office/2019/extlst" xmlns:r="http://schemas.openxmlformats.org/officeDocument/2006/relationships" xmlns:m="http://schemas.openxmlformats.org/officeDocument/2006/math" xmlns:v="urn:schemas-microsoft-com:vml" xmlns:wp14="http://schemas.microsoft.com/office/word/2010/wordprocessingDrawing" xmlns:wp="http://schemas.openxmlformats.org/drawingml/2006/wordprocessingDrawing" xmlns:w10="urn:schemas-microsoft-com:office:word" xmlns:w="http://schemas.openxmlformats.org/wordprocessingml/2006/main" xmlns:w14="http://schemas.microsoft.com/office/word/2010/wordml" xmlns:w15="http://schemas.microsoft.com/office/word/2012/wordml" xmlns:w16cex="http://schemas.microsoft.com/office/word/2018/wordml/cex" xmlns:w16cid="http://schemas.microsoft.com/office/word/2016/wordml/cid" xmlns:w16="http://schemas.microsoft.com/office/word/2018/wordml" xmlns:w16du="http://schemas.microsoft.com/office/word/2023/wordml/word16du" xmlns:w16sdtdh="http://schemas.microsoft.com/office/word/2020/wordml/sdtdatahash" xmlns:w16sdtfl="http://schemas.microsoft.com/office/word/2024/wordml/sdtformatlock" xmlns:w16se="http://schemas.microsoft.com/office/word/2015/wordml/symex" xmlns:wpg="http://schemas.microsoft.com/office/word/2010/wordprocessingGroup" xmlns:wpi="http://schemas.microsoft.com/office/word/2010/wordprocessingInk" xmlns:wne="http://schemas.microsoft.com/office/word/2006/wordml" xmlns:wps="http://schemas.microsoft.com/office/word/2010/wordprocessingShape" mc:Ignorable="w14 w15 w16se w16cid w16 w16cex w16sdtdh w16sdtfl w16du wp14">
+<w:ftr xmlns:wpc="http://schemas.microsoft.com/office/word/2010/wordprocessingCanvas" xmlns:cx="http://schemas.microsoft.com/office/drawing/2014/chartex" xmlns:cx1="http://schemas.microsoft.com/office/drawing/2015/9/8/chartex" xmlns:cx2="http://schemas.microsoft.com/office/drawing/2015/10/21/chartex" xmlns:cx3="http://schemas.microsoft.com/office/drawing/2016/5/9/chartex" xmlns:cx4="http://schemas.microsoft.com/office/drawing/2016/5/10/chartex" xmlns:cx5="http://schemas.microsoft.com/office/drawing/2016/5/11/chartex" xmlns:cx6="http://schemas.microsoft.com/office/drawing/2016/5/12/chartex" xmlns:cx7="http://schemas.microsoft.com/office/drawing/2016/5/13/chartex" xmlns:cx8="http://schemas.microsoft.com/office/drawing/2016/5/14/chartex" xmlns:mc="http://schemas.openxmlformats.org/markup-compatibility/2006" xmlns:m="http://schemas.openxmlformats.org/officeDocument/2006/math" xmlns:aink="http://schemas.microsoft.com/office/drawing/2016/ink" xmlns:am3d="http://schemas.microsoft.com/office/drawing/2017/model3d" xmlns:oel="http://schemas.microsoft.com/office/2019/extlst" xmlns:r="http://schemas.openxmlformats.org/officeDocument/2006/relationships" xmlns:wp14="http://schemas.microsoft.com/office/word/2010/wordprocessingDrawing" xmlns:wp="http://schemas.openxmlformats.org/drawingml/2006/wordprocessingDrawing" xmlns:wpg="http://schemas.microsoft.com/office/word/2010/wordprocessingGroup" xmlns:wpi="http://schemas.microsoft.com/office/word/2010/wordprocessingInk" xmlns:wps="http://schemas.microsoft.com/office/word/2010/wordprocessingShape" xmlns:o="urn:schemas-microsoft-com:office:office" xmlns:v="urn:schemas-microsoft-com:vml" xmlns:w10="urn:schemas-microsoft-com:office:word" xmlns:w="http://schemas.openxmlformats.org/wordprocessingml/2006/main" xmlns:w14="http://schemas.microsoft.com/office/word/2010/wordml" xmlns:w15="http://schemas.microsoft.com/office/word/2012/wordml" xmlns:w16cei="http://schemas.microsoft.com/office/word/2026/wordml/cei" xmlns:w16cex="http://schemas.microsoft.com/office/word/2018/wordml/cex" xmlns:w16cid="http://schemas.microsoft.com/office/word/2016/wordml/cid" xmlns:w16="http://schemas.microsoft.com/office/word/2018/wordml" xmlns:w16sdtdh="http://schemas.microsoft.com/office/word/2020/wordml/sdtdatahash" xmlns:w16sdtfl="http://schemas.microsoft.com/office/word/2024/wordml/sdtformatlock" xmlns:w16se="http://schemas.microsoft.com/office/word/2015/wordml/symex" xmlns:w16du="http://schemas.microsoft.com/office/word/2023/wordml/word16du" xmlns:wne="http://schemas.microsoft.com/office/word/2006/wordml" mc:Ignorable="w14 w15 w16se w16cid w16 w16cex w16sdtdh w16sdtfl w16du wp14">
   <w:p>
     <w:pPr>
       <w:pStyle w:val="Footer"/>
@@ -3682,7 +4116,7 @@
         <w:sz w:val="20"/>
         <w:szCs w:val="20"/>
       </w:rPr>
-      <w:t>12</w:t>
+      <w:t>13</w:t>
     </w:r>
     <w:r>
       <w:rPr>
@@ -3700,16 +4134,7 @@
         <w:sz w:val="20"/>
         <w:szCs w:val="20"/>
       </w:rPr>
-      <w:t>16</w:t>
-    </w:r>
-    <w:r>
-      <w:rPr>
-        <w:rFonts w:cstheme="minorHAnsi"/>
-        <w:color w:val="E64626"/>
-        <w:sz w:val="20"/>
-        <w:szCs w:val="20"/>
-      </w:rPr>
-      <w:t xml:space="preserve"> March </w:t>
+      <w:t xml:space="preserve">28 July </w:t>
     </w:r>
     <w:r>
       <w:rPr>
@@ -3725,18 +4150,8 @@
 </w:ftr>
 </file>
 
-<file path=word/footer3.xml><?xml version="1.0" encoding="utf-8"?>
-<w:ftr xmlns:wpc="http://schemas.microsoft.com/office/word/2010/wordprocessingCanvas" xmlns:cx="http://schemas.microsoft.com/office/drawing/2014/chartex" xmlns:cx1="http://schemas.microsoft.com/office/drawing/2015/9/8/chartex" xmlns:cx2="http://schemas.microsoft.com/office/drawing/2015/10/21/chartex" xmlns:cx3="http://schemas.microsoft.com/office/drawing/2016/5/9/chartex" xmlns:cx4="http://schemas.microsoft.com/office/drawing/2016/5/10/chartex" xmlns:cx5="http://schemas.microsoft.com/office/drawing/2016/5/11/chartex" xmlns:cx6="http://schemas.microsoft.com/office/drawing/2016/5/12/chartex" xmlns:cx7="http://schemas.microsoft.com/office/drawing/2016/5/13/chartex" xmlns:cx8="http://schemas.microsoft.com/office/drawing/2016/5/14/chartex" xmlns:mc="http://schemas.openxmlformats.org/markup-compatibility/2006" xmlns:aink="http://schemas.microsoft.com/office/drawing/2016/ink" xmlns:am3d="http://schemas.microsoft.com/office/drawing/2017/model3d" xmlns:o="urn:schemas-microsoft-com:office:office" xmlns:oel="http://schemas.microsoft.com/office/2019/extlst" xmlns:r="http://schemas.openxmlformats.org/officeDocument/2006/relationships" xmlns:m="http://schemas.openxmlformats.org/officeDocument/2006/math" xmlns:v="urn:schemas-microsoft-com:vml" xmlns:wp14="http://schemas.microsoft.com/office/word/2010/wordprocessingDrawing" xmlns:wp="http://schemas.openxmlformats.org/drawingml/2006/wordprocessingDrawing" xmlns:w10="urn:schemas-microsoft-com:office:word" xmlns:w="http://schemas.openxmlformats.org/wordprocessingml/2006/main" xmlns:w14="http://schemas.microsoft.com/office/word/2010/wordml" xmlns:w15="http://schemas.microsoft.com/office/word/2012/wordml" xmlns:w16cex="http://schemas.microsoft.com/office/word/2018/wordml/cex" xmlns:w16cid="http://schemas.microsoft.com/office/word/2016/wordml/cid" xmlns:w16="http://schemas.microsoft.com/office/word/2018/wordml" xmlns:w16du="http://schemas.microsoft.com/office/word/2023/wordml/word16du" xmlns:w16sdtdh="http://schemas.microsoft.com/office/word/2020/wordml/sdtdatahash" xmlns:w16sdtfl="http://schemas.microsoft.com/office/word/2024/wordml/sdtformatlock" xmlns:w16se="http://schemas.microsoft.com/office/word/2015/wordml/symex" xmlns:wpg="http://schemas.microsoft.com/office/word/2010/wordprocessingGroup" xmlns:wpi="http://schemas.microsoft.com/office/word/2010/wordprocessingInk" xmlns:wne="http://schemas.microsoft.com/office/word/2006/wordml" xmlns:wps="http://schemas.microsoft.com/office/word/2010/wordprocessingShape" mc:Ignorable="w14 w15 w16se w16cid w16 w16cex w16sdtdh w16sdtfl w16du wp14">
-  <w:p>
-    <w:pPr>
-      <w:pStyle w:val="Footer"/>
-    </w:pPr>
-  </w:p>
-</w:ftr>
-</file>
-
 <file path=word/footnotes.xml><?xml version="1.0" encoding="utf-8"?>
-<w:footnotes xmlns:wpc="http://schemas.microsoft.com/office/word/2010/wordprocessingCanvas" xmlns:cx="http://schemas.microsoft.com/office/drawing/2014/chartex" xmlns:cx1="http://schemas.microsoft.com/office/drawing/2015/9/8/chartex" xmlns:cx2="http://schemas.microsoft.com/office/drawing/2015/10/21/chartex" xmlns:cx3="http://schemas.microsoft.com/office/drawing/2016/5/9/chartex" xmlns:cx4="http://schemas.microsoft.com/office/drawing/2016/5/10/chartex" xmlns:cx5="http://schemas.microsoft.com/office/drawing/2016/5/11/chartex" xmlns:cx6="http://schemas.microsoft.com/office/drawing/2016/5/12/chartex" xmlns:cx7="http://schemas.microsoft.com/office/drawing/2016/5/13/chartex" xmlns:cx8="http://schemas.microsoft.com/office/drawing/2016/5/14/chartex" xmlns:mc="http://schemas.openxmlformats.org/markup-compatibility/2006" xmlns:aink="http://schemas.microsoft.com/office/drawing/2016/ink" xmlns:am3d="http://schemas.microsoft.com/office/drawing/2017/model3d" xmlns:o="urn:schemas-microsoft-com:office:office" xmlns:oel="http://schemas.microsoft.com/office/2019/extlst" xmlns:r="http://schemas.openxmlformats.org/officeDocument/2006/relationships" xmlns:m="http://schemas.openxmlformats.org/officeDocument/2006/math" xmlns:v="urn:schemas-microsoft-com:vml" xmlns:wp14="http://schemas.microsoft.com/office/word/2010/wordprocessingDrawing" xmlns:wp="http://schemas.openxmlformats.org/drawingml/2006/wordprocessingDrawing" xmlns:w10="urn:schemas-microsoft-com:office:word" xmlns:w="http://schemas.openxmlformats.org/wordprocessingml/2006/main" xmlns:w14="http://schemas.microsoft.com/office/word/2010/wordml" xmlns:w15="http://schemas.microsoft.com/office/word/2012/wordml" xmlns:w16cex="http://schemas.microsoft.com/office/word/2018/wordml/cex" xmlns:w16cid="http://schemas.microsoft.com/office/word/2016/wordml/cid" xmlns:w16="http://schemas.microsoft.com/office/word/2018/wordml" xmlns:w16du="http://schemas.microsoft.com/office/word/2023/wordml/word16du" xmlns:w16sdtdh="http://schemas.microsoft.com/office/word/2020/wordml/sdtdatahash" xmlns:w16sdtfl="http://schemas.microsoft.com/office/word/2024/wordml/sdtformatlock" xmlns:w16se="http://schemas.microsoft.com/office/word/2015/wordml/symex" xmlns:wpg="http://schemas.microsoft.com/office/word/2010/wordprocessingGroup" xmlns:wpi="http://schemas.microsoft.com/office/word/2010/wordprocessingInk" xmlns:wne="http://schemas.microsoft.com/office/word/2006/wordml" xmlns:wps="http://schemas.microsoft.com/office/word/2010/wordprocessingShape" mc:Ignorable="w14 w15 w16se w16cid w16 w16cex w16sdtdh w16sdtfl w16du wp14">
+<w:footnotes xmlns:wpc="http://schemas.microsoft.com/office/word/2010/wordprocessingCanvas" xmlns:cx="http://schemas.microsoft.com/office/drawing/2014/chartex" xmlns:cx1="http://schemas.microsoft.com/office/drawing/2015/9/8/chartex" xmlns:cx2="http://schemas.microsoft.com/office/drawing/2015/10/21/chartex" xmlns:cx3="http://schemas.microsoft.com/office/drawing/2016/5/9/chartex" xmlns:cx4="http://schemas.microsoft.com/office/drawing/2016/5/10/chartex" xmlns:cx5="http://schemas.microsoft.com/office/drawing/2016/5/11/chartex" xmlns:cx6="http://schemas.microsoft.com/office/drawing/2016/5/12/chartex" xmlns:cx7="http://schemas.microsoft.com/office/drawing/2016/5/13/chartex" xmlns:cx8="http://schemas.microsoft.com/office/drawing/2016/5/14/chartex" xmlns:mc="http://schemas.openxmlformats.org/markup-compatibility/2006" xmlns:m="http://schemas.openxmlformats.org/officeDocument/2006/math" xmlns:aink="http://schemas.microsoft.com/office/drawing/2016/ink" xmlns:am3d="http://schemas.microsoft.com/office/drawing/2017/model3d" xmlns:oel="http://schemas.microsoft.com/office/2019/extlst" xmlns:r="http://schemas.openxmlformats.org/officeDocument/2006/relationships" xmlns:wp14="http://schemas.microsoft.com/office/word/2010/wordprocessingDrawing" xmlns:wp="http://schemas.openxmlformats.org/drawingml/2006/wordprocessingDrawing" xmlns:wpg="http://schemas.microsoft.com/office/word/2010/wordprocessingGroup" xmlns:wpi="http://schemas.microsoft.com/office/word/2010/wordprocessingInk" xmlns:wps="http://schemas.microsoft.com/office/word/2010/wordprocessingShape" xmlns:o="urn:schemas-microsoft-com:office:office" xmlns:v="urn:schemas-microsoft-com:vml" xmlns:w10="urn:schemas-microsoft-com:office:word" xmlns:w="http://schemas.openxmlformats.org/wordprocessingml/2006/main" xmlns:w14="http://schemas.microsoft.com/office/word/2010/wordml" xmlns:w15="http://schemas.microsoft.com/office/word/2012/wordml" xmlns:w16cei="http://schemas.microsoft.com/office/word/2026/wordml/cei" xmlns:w16cex="http://schemas.microsoft.com/office/word/2018/wordml/cex" xmlns:w16cid="http://schemas.microsoft.com/office/word/2016/wordml/cid" xmlns:w16="http://schemas.microsoft.com/office/word/2018/wordml" xmlns:w16sdtdh="http://schemas.microsoft.com/office/word/2020/wordml/sdtdatahash" xmlns:w16sdtfl="http://schemas.microsoft.com/office/word/2024/wordml/sdtformatlock" xmlns:w16se="http://schemas.microsoft.com/office/word/2015/wordml/symex" xmlns:w16du="http://schemas.microsoft.com/office/word/2023/wordml/word16du" xmlns:wne="http://schemas.microsoft.com/office/word/2006/wordml" mc:Ignorable="w14 w15 w16se w16cid w16 w16cex w16sdtdh w16sdtfl w16du wp14">
   <w:footnote w:type="separator" w:id="-1">
     <w:p>
       <w:pPr>
@@ -3763,7 +4178,7 @@
 </file>
 
 <file path=word/header1.xml><?xml version="1.0" encoding="utf-8"?>
-<w:hdr xmlns:wpc="http://schemas.microsoft.com/office/word/2010/wordprocessingCanvas" xmlns:cx="http://schemas.microsoft.com/office/drawing/2014/chartex" xmlns:cx1="http://schemas.microsoft.com/office/drawing/2015/9/8/chartex" xmlns:cx2="http://schemas.microsoft.com/office/drawing/2015/10/21/chartex" xmlns:cx3="http://schemas.microsoft.com/office/drawing/2016/5/9/chartex" xmlns:cx4="http://schemas.microsoft.com/office/drawing/2016/5/10/chartex" xmlns:cx5="http://schemas.microsoft.com/office/drawing/2016/5/11/chartex" xmlns:cx6="http://schemas.microsoft.com/office/drawing/2016/5/12/chartex" xmlns:cx7="http://schemas.microsoft.com/office/drawing/2016/5/13/chartex" xmlns:cx8="http://schemas.microsoft.com/office/drawing/2016/5/14/chartex" xmlns:mc="http://schemas.openxmlformats.org/markup-compatibility/2006" xmlns:aink="http://schemas.microsoft.com/office/drawing/2016/ink" xmlns:am3d="http://schemas.microsoft.com/office/drawing/2017/model3d" xmlns:o="urn:schemas-microsoft-com:office:office" xmlns:oel="http://schemas.microsoft.com/office/2019/extlst" xmlns:r="http://schemas.openxmlformats.org/officeDocument/2006/relationships" xmlns:m="http://schemas.openxmlformats.org/officeDocument/2006/math" xmlns:v="urn:schemas-microsoft-com:vml" xmlns:wp14="http://schemas.microsoft.com/office/word/2010/wordprocessingDrawing" xmlns:wp="http://schemas.openxmlformats.org/drawingml/2006/wordprocessingDrawing" xmlns:w10="urn:schemas-microsoft-com:office:word" xmlns:w="http://schemas.openxmlformats.org/wordprocessingml/2006/main" xmlns:w14="http://schemas.microsoft.com/office/word/2010/wordml" xmlns:w15="http://schemas.microsoft.com/office/word/2012/wordml" xmlns:w16cex="http://schemas.microsoft.com/office/word/2018/wordml/cex" xmlns:w16cid="http://schemas.microsoft.com/office/word/2016/wordml/cid" xmlns:w16="http://schemas.microsoft.com/office/word/2018/wordml" xmlns:w16du="http://schemas.microsoft.com/office/word/2023/wordml/word16du" xmlns:w16sdtdh="http://schemas.microsoft.com/office/word/2020/wordml/sdtdatahash" xmlns:w16sdtfl="http://schemas.microsoft.com/office/word/2024/wordml/sdtformatlock" xmlns:w16se="http://schemas.microsoft.com/office/word/2015/wordml/symex" xmlns:wpg="http://schemas.microsoft.com/office/word/2010/wordprocessingGroup" xmlns:wpi="http://schemas.microsoft.com/office/word/2010/wordprocessingInk" xmlns:wne="http://schemas.microsoft.com/office/word/2006/wordml" xmlns:wps="http://schemas.microsoft.com/office/word/2010/wordprocessingShape" mc:Ignorable="w14 w15 w16se w16cid w16 w16cex w16sdtdh w16sdtfl w16du wp14">
+<w:hdr xmlns:wpc="http://schemas.microsoft.com/office/word/2010/wordprocessingCanvas" xmlns:cx="http://schemas.microsoft.com/office/drawing/2014/chartex" xmlns:cx1="http://schemas.microsoft.com/office/drawing/2015/9/8/chartex" xmlns:cx2="http://schemas.microsoft.com/office/drawing/2015/10/21/chartex" xmlns:cx3="http://schemas.microsoft.com/office/drawing/2016/5/9/chartex" xmlns:cx4="http://schemas.microsoft.com/office/drawing/2016/5/10/chartex" xmlns:cx5="http://schemas.microsoft.com/office/drawing/2016/5/11/chartex" xmlns:cx6="http://schemas.microsoft.com/office/drawing/2016/5/12/chartex" xmlns:cx7="http://schemas.microsoft.com/office/drawing/2016/5/13/chartex" xmlns:cx8="http://schemas.microsoft.com/office/drawing/2016/5/14/chartex" xmlns:mc="http://schemas.openxmlformats.org/markup-compatibility/2006" xmlns:m="http://schemas.openxmlformats.org/officeDocument/2006/math" xmlns:aink="http://schemas.microsoft.com/office/drawing/2016/ink" xmlns:am3d="http://schemas.microsoft.com/office/drawing/2017/model3d" xmlns:oel="http://schemas.microsoft.com/office/2019/extlst" xmlns:r="http://schemas.openxmlformats.org/officeDocument/2006/relationships" xmlns:wp14="http://schemas.microsoft.com/office/word/2010/wordprocessingDrawing" xmlns:wp="http://schemas.openxmlformats.org/drawingml/2006/wordprocessingDrawing" xmlns:wpg="http://schemas.microsoft.com/office/word/2010/wordprocessingGroup" xmlns:wpi="http://schemas.microsoft.com/office/word/2010/wordprocessingInk" xmlns:wps="http://schemas.microsoft.com/office/word/2010/wordprocessingShape" xmlns:o="urn:schemas-microsoft-com:office:office" xmlns:v="urn:schemas-microsoft-com:vml" xmlns:w10="urn:schemas-microsoft-com:office:word" xmlns:w="http://schemas.openxmlformats.org/wordprocessingml/2006/main" xmlns:w14="http://schemas.microsoft.com/office/word/2010/wordml" xmlns:w15="http://schemas.microsoft.com/office/word/2012/wordml" xmlns:w16cei="http://schemas.microsoft.com/office/word/2026/wordml/cei" xmlns:w16cex="http://schemas.microsoft.com/office/word/2018/wordml/cex" xmlns:w16cid="http://schemas.microsoft.com/office/word/2016/wordml/cid" xmlns:w16="http://schemas.microsoft.com/office/word/2018/wordml" xmlns:w16sdtdh="http://schemas.microsoft.com/office/word/2020/wordml/sdtdatahash" xmlns:w16sdtfl="http://schemas.microsoft.com/office/word/2024/wordml/sdtformatlock" xmlns:w16se="http://schemas.microsoft.com/office/word/2015/wordml/symex" xmlns:w16du="http://schemas.microsoft.com/office/word/2023/wordml/word16du" xmlns:wne="http://schemas.microsoft.com/office/word/2006/wordml" mc:Ignorable="w14 w15 w16se w16cid w16 w16cex w16sdtdh w16sdtfl w16du wp14">
   <w:p>
     <w:pPr>
       <w:pStyle w:val="Header"/>
@@ -3774,7 +4189,7 @@
 </file>
 
 <file path=word/header2.xml><?xml version="1.0" encoding="utf-8"?>
-<w:hdr xmlns:wpc="http://schemas.microsoft.com/office/word/2010/wordprocessingCanvas" xmlns:cx="http://schemas.microsoft.com/office/drawing/2014/chartex" xmlns:cx1="http://schemas.microsoft.com/office/drawing/2015/9/8/chartex" xmlns:cx2="http://schemas.microsoft.com/office/drawing/2015/10/21/chartex" xmlns:cx3="http://schemas.microsoft.com/office/drawing/2016/5/9/chartex" xmlns:cx4="http://schemas.microsoft.com/office/drawing/2016/5/10/chartex" xmlns:cx5="http://schemas.microsoft.com/office/drawing/2016/5/11/chartex" xmlns:cx6="http://schemas.microsoft.com/office/drawing/2016/5/12/chartex" xmlns:cx7="http://schemas.microsoft.com/office/drawing/2016/5/13/chartex" xmlns:cx8="http://schemas.microsoft.com/office/drawing/2016/5/14/chartex" xmlns:mc="http://schemas.openxmlformats.org/markup-compatibility/2006" xmlns:aink="http://schemas.microsoft.com/office/drawing/2016/ink" xmlns:am3d="http://schemas.microsoft.com/office/drawing/2017/model3d" xmlns:o="urn:schemas-microsoft-com:office:office" xmlns:oel="http://schemas.microsoft.com/office/2019/extlst" xmlns:r="http://schemas.openxmlformats.org/officeDocument/2006/relationships" xmlns:m="http://schemas.openxmlformats.org/officeDocument/2006/math" xmlns:v="urn:schemas-microsoft-com:vml" xmlns:wp14="http://schemas.microsoft.com/office/word/2010/wordprocessingDrawing" xmlns:wp="http://schemas.openxmlformats.org/drawingml/2006/wordprocessingDrawing" xmlns:w10="urn:schemas-microsoft-com:office:word" xmlns:w="http://schemas.openxmlformats.org/wordprocessingml/2006/main" xmlns:w14="http://schemas.microsoft.com/office/word/2010/wordml" xmlns:w15="http://schemas.microsoft.com/office/word/2012/wordml" xmlns:w16cex="http://schemas.microsoft.com/office/word/2018/wordml/cex" xmlns:w16cid="http://schemas.microsoft.com/office/word/2016/wordml/cid" xmlns:w16="http://schemas.microsoft.com/office/word/2018/wordml" xmlns:w16du="http://schemas.microsoft.com/office/word/2023/wordml/word16du" xmlns:w16sdtdh="http://schemas.microsoft.com/office/word/2020/wordml/sdtdatahash" xmlns:w16sdtfl="http://schemas.microsoft.com/office/word/2024/wordml/sdtformatlock" xmlns:w16se="http://schemas.microsoft.com/office/word/2015/wordml/symex" xmlns:wpg="http://schemas.microsoft.com/office/word/2010/wordprocessingGroup" xmlns:wpi="http://schemas.microsoft.com/office/word/2010/wordprocessingInk" xmlns:wne="http://schemas.microsoft.com/office/word/2006/wordml" xmlns:wps="http://schemas.microsoft.com/office/word/2010/wordprocessingShape" mc:Ignorable="w14 w15 w16se w16cid w16 w16cex w16sdtdh w16sdtfl w16du wp14">
+<w:hdr xmlns:wpc="http://schemas.microsoft.com/office/word/2010/wordprocessingCanvas" xmlns:cx="http://schemas.microsoft.com/office/drawing/2014/chartex" xmlns:cx1="http://schemas.microsoft.com/office/drawing/2015/9/8/chartex" xmlns:cx2="http://schemas.microsoft.com/office/drawing/2015/10/21/chartex" xmlns:cx3="http://schemas.microsoft.com/office/drawing/2016/5/9/chartex" xmlns:cx4="http://schemas.microsoft.com/office/drawing/2016/5/10/chartex" xmlns:cx5="http://schemas.microsoft.com/office/drawing/2016/5/11/chartex" xmlns:cx6="http://schemas.microsoft.com/office/drawing/2016/5/12/chartex" xmlns:cx7="http://schemas.microsoft.com/office/drawing/2016/5/13/chartex" xmlns:cx8="http://schemas.microsoft.com/office/drawing/2016/5/14/chartex" xmlns:mc="http://schemas.openxmlformats.org/markup-compatibility/2006" xmlns:m="http://schemas.openxmlformats.org/officeDocument/2006/math" xmlns:aink="http://schemas.microsoft.com/office/drawing/2016/ink" xmlns:am3d="http://schemas.microsoft.com/office/drawing/2017/model3d" xmlns:oel="http://schemas.microsoft.com/office/2019/extlst" xmlns:r="http://schemas.openxmlformats.org/officeDocument/2006/relationships" xmlns:wp14="http://schemas.microsoft.com/office/word/2010/wordprocessingDrawing" xmlns:wp="http://schemas.openxmlformats.org/drawingml/2006/wordprocessingDrawing" xmlns:wpg="http://schemas.microsoft.com/office/word/2010/wordprocessingGroup" xmlns:wpi="http://schemas.microsoft.com/office/word/2010/wordprocessingInk" xmlns:wps="http://schemas.microsoft.com/office/word/2010/wordprocessingShape" xmlns:o="urn:schemas-microsoft-com:office:office" xmlns:v="urn:schemas-microsoft-com:vml" xmlns:w10="urn:schemas-microsoft-com:office:word" xmlns:w="http://schemas.openxmlformats.org/wordprocessingml/2006/main" xmlns:w14="http://schemas.microsoft.com/office/word/2010/wordml" xmlns:w15="http://schemas.microsoft.com/office/word/2012/wordml" xmlns:w16cei="http://schemas.microsoft.com/office/word/2026/wordml/cei" xmlns:w16cex="http://schemas.microsoft.com/office/word/2018/wordml/cex" xmlns:w16cid="http://schemas.microsoft.com/office/word/2016/wordml/cid" xmlns:w16="http://schemas.microsoft.com/office/word/2018/wordml" xmlns:w16sdtdh="http://schemas.microsoft.com/office/word/2020/wordml/sdtdatahash" xmlns:w16sdtfl="http://schemas.microsoft.com/office/word/2024/wordml/sdtformatlock" xmlns:w16se="http://schemas.microsoft.com/office/word/2015/wordml/symex" xmlns:w16du="http://schemas.microsoft.com/office/word/2023/wordml/word16du" xmlns:wne="http://schemas.microsoft.com/office/word/2006/wordml" mc:Ignorable="w14 w15 w16se w16cid w16 w16cex w16sdtdh w16sdtfl w16du wp14">
   <w:p>
     <w:pPr>
       <w:pStyle w:val="Header"/>
@@ -3784,18 +4199,8 @@
 </w:hdr>
 </file>
 
-<file path=word/header3.xml><?xml version="1.0" encoding="utf-8"?>
-<w:hdr xmlns:wpc="http://schemas.microsoft.com/office/word/2010/wordprocessingCanvas" xmlns:cx="http://schemas.microsoft.com/office/drawing/2014/chartex" xmlns:cx1="http://schemas.microsoft.com/office/drawing/2015/9/8/chartex" xmlns:cx2="http://schemas.microsoft.com/office/drawing/2015/10/21/chartex" xmlns:cx3="http://schemas.microsoft.com/office/drawing/2016/5/9/chartex" xmlns:cx4="http://schemas.microsoft.com/office/drawing/2016/5/10/chartex" xmlns:cx5="http://schemas.microsoft.com/office/drawing/2016/5/11/chartex" xmlns:cx6="http://schemas.microsoft.com/office/drawing/2016/5/12/chartex" xmlns:cx7="http://schemas.microsoft.com/office/drawing/2016/5/13/chartex" xmlns:cx8="http://schemas.microsoft.com/office/drawing/2016/5/14/chartex" xmlns:mc="http://schemas.openxmlformats.org/markup-compatibility/2006" xmlns:aink="http://schemas.microsoft.com/office/drawing/2016/ink" xmlns:am3d="http://schemas.microsoft.com/office/drawing/2017/model3d" xmlns:o="urn:schemas-microsoft-com:office:office" xmlns:oel="http://schemas.microsoft.com/office/2019/extlst" xmlns:r="http://schemas.openxmlformats.org/officeDocument/2006/relationships" xmlns:m="http://schemas.openxmlformats.org/officeDocument/2006/math" xmlns:v="urn:schemas-microsoft-com:vml" xmlns:wp14="http://schemas.microsoft.com/office/word/2010/wordprocessingDrawing" xmlns:wp="http://schemas.openxmlformats.org/drawingml/2006/wordprocessingDrawing" xmlns:w10="urn:schemas-microsoft-com:office:word" xmlns:w="http://schemas.openxmlformats.org/wordprocessingml/2006/main" xmlns:w14="http://schemas.microsoft.com/office/word/2010/wordml" xmlns:w15="http://schemas.microsoft.com/office/word/2012/wordml" xmlns:w16cex="http://schemas.microsoft.com/office/word/2018/wordml/cex" xmlns:w16cid="http://schemas.microsoft.com/office/word/2016/wordml/cid" xmlns:w16="http://schemas.microsoft.com/office/word/2018/wordml" xmlns:w16du="http://schemas.microsoft.com/office/word/2023/wordml/word16du" xmlns:w16sdtdh="http://schemas.microsoft.com/office/word/2020/wordml/sdtdatahash" xmlns:w16sdtfl="http://schemas.microsoft.com/office/word/2024/wordml/sdtformatlock" xmlns:w16se="http://schemas.microsoft.com/office/word/2015/wordml/symex" xmlns:wpg="http://schemas.microsoft.com/office/word/2010/wordprocessingGroup" xmlns:wpi="http://schemas.microsoft.com/office/word/2010/wordprocessingInk" xmlns:wne="http://schemas.microsoft.com/office/word/2006/wordml" xmlns:wps="http://schemas.microsoft.com/office/word/2010/wordprocessingShape" mc:Ignorable="w14 w15 w16se w16cid w16 w16cex w16sdtdh w16sdtfl w16du wp14">
-  <w:p>
-    <w:pPr>
-      <w:pStyle w:val="Header"/>
-    </w:pPr>
-  </w:p>
-</w:hdr>
-</file>
-
 <file path=word/numbering.xml><?xml version="1.0" encoding="utf-8"?>
-<w:numbering xmlns:wpc="http://schemas.microsoft.com/office/word/2010/wordprocessingCanvas" xmlns:cx="http://schemas.microsoft.com/office/drawing/2014/chartex" xmlns:cx1="http://schemas.microsoft.com/office/drawing/2015/9/8/chartex" xmlns:cx2="http://schemas.microsoft.com/office/drawing/2015/10/21/chartex" xmlns:cx3="http://schemas.microsoft.com/office/drawing/2016/5/9/chartex" xmlns:cx4="http://schemas.microsoft.com/office/drawing/2016/5/10/chartex" xmlns:cx5="http://schemas.microsoft.com/office/drawing/2016/5/11/chartex" xmlns:cx6="http://schemas.microsoft.com/office/drawing/2016/5/12/chartex" xmlns:cx7="http://schemas.microsoft.com/office/drawing/2016/5/13/chartex" xmlns:cx8="http://schemas.microsoft.com/office/drawing/2016/5/14/chartex" xmlns:mc="http://schemas.openxmlformats.org/markup-compatibility/2006" xmlns:aink="http://schemas.microsoft.com/office/drawing/2016/ink" xmlns:am3d="http://schemas.microsoft.com/office/drawing/2017/model3d" xmlns:o="urn:schemas-microsoft-com:office:office" xmlns:oel="http://schemas.microsoft.com/office/2019/extlst" xmlns:r="http://schemas.openxmlformats.org/officeDocument/2006/relationships" xmlns:m="http://schemas.openxmlformats.org/officeDocument/2006/math" xmlns:v="urn:schemas-microsoft-com:vml" xmlns:wp14="http://schemas.microsoft.com/office/word/2010/wordprocessingDrawing" xmlns:wp="http://schemas.openxmlformats.org/drawingml/2006/wordprocessingDrawing" xmlns:w10="urn:schemas-microsoft-com:office:word" xmlns:w="http://schemas.openxmlformats.org/wordprocessingml/2006/main" xmlns:w14="http://schemas.microsoft.com/office/word/2010/wordml" xmlns:w15="http://schemas.microsoft.com/office/word/2012/wordml" xmlns:w16cex="http://schemas.microsoft.com/office/word/2018/wordml/cex" xmlns:w16cid="http://schemas.microsoft.com/office/word/2016/wordml/cid" xmlns:w16="http://schemas.microsoft.com/office/word/2018/wordml" xmlns:w16du="http://schemas.microsoft.com/office/word/2023/wordml/word16du" xmlns:w16sdtdh="http://schemas.microsoft.com/office/word/2020/wordml/sdtdatahash" xmlns:w16sdtfl="http://schemas.microsoft.com/office/word/2024/wordml/sdtformatlock" xmlns:w16se="http://schemas.microsoft.com/office/word/2015/wordml/symex" xmlns:wpg="http://schemas.microsoft.com/office/word/2010/wordprocessingGroup" xmlns:wpi="http://schemas.microsoft.com/office/word/2010/wordprocessingInk" xmlns:wne="http://schemas.microsoft.com/office/word/2006/wordml" xmlns:wps="http://schemas.microsoft.com/office/word/2010/wordprocessingShape" mc:Ignorable="w14 w15 w16se w16cid w16 w16cex w16sdtdh w16sdtfl w16du wp14">
+<w:numbering xmlns:wpc="http://schemas.microsoft.com/office/word/2010/wordprocessingCanvas" xmlns:cx="http://schemas.microsoft.com/office/drawing/2014/chartex" xmlns:cx1="http://schemas.microsoft.com/office/drawing/2015/9/8/chartex" xmlns:cx2="http://schemas.microsoft.com/office/drawing/2015/10/21/chartex" xmlns:cx3="http://schemas.microsoft.com/office/drawing/2016/5/9/chartex" xmlns:cx4="http://schemas.microsoft.com/office/drawing/2016/5/10/chartex" xmlns:cx5="http://schemas.microsoft.com/office/drawing/2016/5/11/chartex" xmlns:cx6="http://schemas.microsoft.com/office/drawing/2016/5/12/chartex" xmlns:cx7="http://schemas.microsoft.com/office/drawing/2016/5/13/chartex" xmlns:cx8="http://schemas.microsoft.com/office/drawing/2016/5/14/chartex" xmlns:mc="http://schemas.openxmlformats.org/markup-compatibility/2006" xmlns:m="http://schemas.openxmlformats.org/officeDocument/2006/math" xmlns:aink="http://schemas.microsoft.com/office/drawing/2016/ink" xmlns:am3d="http://schemas.microsoft.com/office/drawing/2017/model3d" xmlns:oel="http://schemas.microsoft.com/office/2019/extlst" xmlns:r="http://schemas.openxmlformats.org/officeDocument/2006/relationships" xmlns:wp14="http://schemas.microsoft.com/office/word/2010/wordprocessingDrawing" xmlns:wp="http://schemas.openxmlformats.org/drawingml/2006/wordprocessingDrawing" xmlns:wpg="http://schemas.microsoft.com/office/word/2010/wordprocessingGroup" xmlns:wpi="http://schemas.microsoft.com/office/word/2010/wordprocessingInk" xmlns:wps="http://schemas.microsoft.com/office/word/2010/wordprocessingShape" xmlns:o="urn:schemas-microsoft-com:office:office" xmlns:v="urn:schemas-microsoft-com:vml" xmlns:w10="urn:schemas-microsoft-com:office:word" xmlns:w="http://schemas.openxmlformats.org/wordprocessingml/2006/main" xmlns:w14="http://schemas.microsoft.com/office/word/2010/wordml" xmlns:w15="http://schemas.microsoft.com/office/word/2012/wordml" xmlns:w16cei="http://schemas.microsoft.com/office/word/2026/wordml/cei" xmlns:w16cex="http://schemas.microsoft.com/office/word/2018/wordml/cex" xmlns:w16cid="http://schemas.microsoft.com/office/word/2016/wordml/cid" xmlns:w16="http://schemas.microsoft.com/office/word/2018/wordml" xmlns:w16sdtdh="http://schemas.microsoft.com/office/word/2020/wordml/sdtdatahash" xmlns:w16sdtfl="http://schemas.microsoft.com/office/word/2024/wordml/sdtformatlock" xmlns:w16se="http://schemas.microsoft.com/office/word/2015/wordml/symex" xmlns:w16du="http://schemas.microsoft.com/office/word/2023/wordml/word16du" xmlns:wne="http://schemas.microsoft.com/office/word/2006/wordml" mc:Ignorable="w14 w15 w16se w16cid w16 w16cex w16sdtdh w16sdtfl w16du wp14">
   <w:abstractNum w:abstractNumId="0" w15:restartNumberingAfterBreak="0">
     <w:nsid w:val="020F2B2A"/>
     <w:multiLevelType w:val="hybridMultilevel"/>
@@ -4822,7 +5227,7 @@
 </file>
 
 <file path=word/styles.xml><?xml version="1.0" encoding="utf-8"?>
-<w:styles xmlns:mc="http://schemas.openxmlformats.org/markup-compatibility/2006" xmlns:r="http://schemas.openxmlformats.org/officeDocument/2006/relationships" xmlns:w="http://schemas.openxmlformats.org/wordprocessingml/2006/main" xmlns:w14="http://schemas.microsoft.com/office/word/2010/wordml" xmlns:w15="http://schemas.microsoft.com/office/word/2012/wordml" xmlns:w16cex="http://schemas.microsoft.com/office/word/2018/wordml/cex" xmlns:w16cid="http://schemas.microsoft.com/office/word/2016/wordml/cid" xmlns:w16="http://schemas.microsoft.com/office/word/2018/wordml" xmlns:w16du="http://schemas.microsoft.com/office/word/2023/wordml/word16du" xmlns:w16sdtdh="http://schemas.microsoft.com/office/word/2020/wordml/sdtdatahash" xmlns:w16sdtfl="http://schemas.microsoft.com/office/word/2024/wordml/sdtformatlock" xmlns:w16se="http://schemas.microsoft.com/office/word/2015/wordml/symex" mc:Ignorable="w14 w15 w16se w16cid w16 w16cex w16sdtdh w16sdtfl w16du">
+<w:styles xmlns:mc="http://schemas.openxmlformats.org/markup-compatibility/2006" xmlns:r="http://schemas.openxmlformats.org/officeDocument/2006/relationships" xmlns:w="http://schemas.openxmlformats.org/wordprocessingml/2006/main" xmlns:w14="http://schemas.microsoft.com/office/word/2010/wordml" xmlns:w15="http://schemas.microsoft.com/office/word/2012/wordml" xmlns:w16cex="http://schemas.microsoft.com/office/word/2018/wordml/cex" xmlns:w16cid="http://schemas.microsoft.com/office/word/2016/wordml/cid" xmlns:w16="http://schemas.microsoft.com/office/word/2018/wordml" xmlns:w16sdtdh="http://schemas.microsoft.com/office/word/2020/wordml/sdtdatahash" xmlns:w16sdtfl="http://schemas.microsoft.com/office/word/2024/wordml/sdtformatlock" xmlns:w16se="http://schemas.microsoft.com/office/word/2015/wordml/symex" xmlns:w16du="http://schemas.microsoft.com/office/word/2023/wordml/word16du" mc:Ignorable="w14 w15 w16se w16cid w16 w16cex w16sdtdh w16sdtfl w16du">
   <w:docDefaults>
     <w:rPrDefault>
       <w:rPr>

</xml_diff>